<commit_message>
Description des modificatio 8111111331114411111111111ثثثثثثثثثثfffffffffgggggggege;jkkkkkmmmggg
</commit_message>
<xml_diff>
--- a/TDs/TD06_corrige1.docx
+++ b/TDs/TD06_corrige1.docx
@@ -1,6 +1,6 @@
 
 <file path=word/document.xml><?xml version="1.0" encoding="utf-8"?>
-<w:document xmlns:wpc="http://schemas.microsoft.com/office/word/2010/wordprocessingCanvas" xmlns:mc="http://schemas.openxmlformats.org/markup-compatibility/2006" xmlns:o="urn:schemas-microsoft-com:office:office" xmlns:r="http://schemas.openxmlformats.org/officeDocument/2006/relationships" xmlns:m="http://schemas.openxmlformats.org/officeDocument/2006/math" xmlns:v="urn:schemas-microsoft-com:vml" xmlns:wp14="http://schemas.microsoft.com/office/word/2010/wordprocessingDrawing" xmlns:wp="http://schemas.openxmlformats.org/drawingml/2006/wordprocessingDrawing" xmlns:w="http://schemas.openxmlformats.org/wordprocessingml/2006/main" xmlns:w14="http://schemas.microsoft.com/office/word/2010/wordml" xmlns:w10="urn:schemas-microsoft-com:office:word" xmlns:w15="http://schemas.microsoft.com/office/word/2012/wordml" xmlns:wpg="http://schemas.microsoft.com/office/word/2010/wordprocessingGroup" xmlns:wpi="http://schemas.microsoft.com/office/word/2010/wordprocessingInk" xmlns:wne="http://schemas.microsoft.com/office/word/2006/wordml" xmlns:wps="http://schemas.microsoft.com/office/word/2010/wordprocessingShape" xmlns:wpsCustomData="http://www.wps.cn/officeDocument/2013/wpsCustomData" mc:Ignorable="w14 w15 wp14">
+<w:document xmlns:wpc="http://schemas.microsoft.com/office/word/2010/wordprocessingCanvas" xmlns:cx="http://schemas.microsoft.com/office/drawing/2014/chartex" xmlns:cx1="http://schemas.microsoft.com/office/drawing/2015/9/8/chartex" xmlns:cx2="http://schemas.microsoft.com/office/drawing/2015/10/21/chartex" xmlns:cx3="http://schemas.microsoft.com/office/drawing/2016/5/9/chartex" xmlns:cx4="http://schemas.microsoft.com/office/drawing/2016/5/10/chartex" xmlns:cx5="http://schemas.microsoft.com/office/drawing/2016/5/11/chartex" xmlns:cx6="http://schemas.microsoft.com/office/drawing/2016/5/12/chartex" xmlns:cx7="http://schemas.microsoft.com/office/drawing/2016/5/13/chartex" xmlns:cx8="http://schemas.microsoft.com/office/drawing/2016/5/14/chartex" xmlns:mc="http://schemas.openxmlformats.org/markup-compatibility/2006" xmlns:aink="http://schemas.microsoft.com/office/drawing/2016/ink" xmlns:am3d="http://schemas.microsoft.com/office/drawing/2017/model3d" xmlns:o="urn:schemas-microsoft-com:office:office" xmlns:oel="http://schemas.microsoft.com/office/2019/extlst" xmlns:r="http://schemas.openxmlformats.org/officeDocument/2006/relationships" xmlns:m="http://schemas.openxmlformats.org/officeDocument/2006/math" xmlns:v="urn:schemas-microsoft-com:vml" xmlns:wp14="http://schemas.microsoft.com/office/word/2010/wordprocessingDrawing" xmlns:wp="http://schemas.openxmlformats.org/drawingml/2006/wordprocessingDrawing" xmlns:w10="urn:schemas-microsoft-com:office:word" xmlns:w="http://schemas.openxmlformats.org/wordprocessingml/2006/main" xmlns:w14="http://schemas.microsoft.com/office/word/2010/wordml" xmlns:w15="http://schemas.microsoft.com/office/word/2012/wordml" xmlns:w16cex="http://schemas.microsoft.com/office/word/2018/wordml/cex" xmlns:w16cid="http://schemas.microsoft.com/office/word/2016/wordml/cid" xmlns:w16="http://schemas.microsoft.com/office/word/2018/wordml" xmlns:w16du="http://schemas.microsoft.com/office/word/2023/wordml/word16du" xmlns:w16sdtdh="http://schemas.microsoft.com/office/word/2020/wordml/sdtdatahash" xmlns:w16sdtfl="http://schemas.microsoft.com/office/word/2024/wordml/sdtformatlock" xmlns:w16se="http://schemas.microsoft.com/office/word/2015/wordml/symex" xmlns:wpg="http://schemas.microsoft.com/office/word/2010/wordprocessingGroup" xmlns:wpi="http://schemas.microsoft.com/office/word/2010/wordprocessingInk" xmlns:wne="http://schemas.microsoft.com/office/word/2006/wordml" xmlns:wps="http://schemas.microsoft.com/office/word/2010/wordprocessingShape" mc:Ignorable="w14 w15 w16se w16cid w16 w16cex w16sdtdh w16sdtfl w16du wp14">
   <w:body>
     <w:p>
       <w:pPr>
@@ -23,20 +23,16 @@
             <w14:prstDash w14:val="solid"/>
             <w14:round/>
           </w14:textOutline>
-          <w14:textFill>
-            <w14:solidFill>
-              <w14:schemeClr w14:val="tx1"/>
-            </w14:solidFill>
-          </w14:textFill>
-        </w:rPr>
-      </w:pPr>
-      <w:r>
-        <w:rPr>
+        </w:rPr>
+      </w:pPr>
+      <w:r>
+        <w:rPr>
+          <w:noProof/>
           <w:sz w:val="52"/>
           <w:szCs w:val="52"/>
         </w:rPr>
         <w:drawing>
-          <wp:anchor distT="0" distB="0" distL="114300" distR="114300" simplePos="0" relativeHeight="251659264" behindDoc="1" locked="0" layoutInCell="1" allowOverlap="1">
+          <wp:anchor distT="0" distB="0" distL="114300" distR="114300" simplePos="0" relativeHeight="251659264" behindDoc="1" locked="0" layoutInCell="1" allowOverlap="1" wp14:anchorId="47E2B5E0" wp14:editId="5F681A88">
             <wp:simplePos x="0" y="0"/>
             <wp:positionH relativeFrom="column">
               <wp:posOffset>-353695</wp:posOffset>
@@ -47,7 +43,7 @@
             <wp:extent cx="5760720" cy="2320290"/>
             <wp:effectExtent l="19050" t="19050" r="11430" b="22860"/>
             <wp:wrapTight wrapText="bothSides">
-              <wp:wrapPolygon>
+              <wp:wrapPolygon edited="0">
                 <wp:start x="-71" y="-177"/>
                 <wp:lineTo x="-71" y="21635"/>
                 <wp:lineTo x="21571" y="21635"/>
@@ -100,6 +96,7 @@
           </wp:anchor>
         </w:drawing>
       </w:r>
+      <w:proofErr w:type="spellStart"/>
       <w:r>
         <w:rPr>
           <w:b/>
@@ -119,17 +116,11 @@
             <w14:prstDash w14:val="solid"/>
             <w14:round/>
           </w14:textOutline>
-          <w14:textFill>
-            <w14:solidFill>
-              <w14:schemeClr w14:val="tx1"/>
-            </w14:solidFill>
-          </w14:textFill>
-        </w:rPr>
-        <w:t>Geometry of Mass</w:t>
-      </w:r>
-    </w:p>
-    <w:p>
-      <w:pPr>
+        </w:rPr>
+        <w:t>Geometry</w:t>
+      </w:r>
+      <w:proofErr w:type="spellEnd"/>
+      <w:r>
         <w:rPr>
           <w:b/>
           <w:bCs/>
@@ -148,20 +139,40 @@
             <w14:prstDash w14:val="solid"/>
             <w14:round/>
           </w14:textOutline>
-          <w14:textFill>
+        </w:rPr>
+        <w:t xml:space="preserve"> of Mass</w:t>
+      </w:r>
+    </w:p>
+    <w:p>
+      <w:pPr>
+        <w:rPr>
+          <w:b/>
+          <w:bCs/>
+          <w:color w:val="000000" w:themeColor="text1"/>
+          <w:sz w:val="52"/>
+          <w:szCs w:val="52"/>
+          <w14:shadow w14:blurRad="12700" w14:dist="38100" w14:dir="2700000" w14:sx="100000" w14:sy="100000" w14:kx="0" w14:ky="0" w14:algn="tl">
+            <w14:schemeClr w14:val="bg1">
+              <w14:lumMod w14:val="50000"/>
+            </w14:schemeClr>
+          </w14:shadow>
+          <w14:textOutline w14:w="9525" w14:cap="flat" w14:cmpd="sng" w14:algn="ctr">
             <w14:solidFill>
-              <w14:schemeClr w14:val="tx1"/>
+              <w14:schemeClr w14:val="bg1"/>
             </w14:solidFill>
-          </w14:textFill>
-        </w:rPr>
-      </w:pPr>
-      <w:r>
-        <w:rPr>
+            <w14:prstDash w14:val="solid"/>
+            <w14:round/>
+          </w14:textOutline>
+        </w:rPr>
+      </w:pPr>
+      <w:r>
+        <w:rPr>
+          <w:noProof/>
           <w:sz w:val="52"/>
           <w:szCs w:val="52"/>
         </w:rPr>
         <w:drawing>
-          <wp:anchor distT="0" distB="0" distL="114300" distR="114300" simplePos="0" relativeHeight="251660288" behindDoc="1" locked="0" layoutInCell="1" allowOverlap="1">
+          <wp:anchor distT="0" distB="0" distL="114300" distR="114300" simplePos="0" relativeHeight="251660288" behindDoc="1" locked="0" layoutInCell="1" allowOverlap="1" wp14:anchorId="37CEAA2D" wp14:editId="0E6340DD">
             <wp:simplePos x="0" y="0"/>
             <wp:positionH relativeFrom="column">
               <wp:posOffset>-495935</wp:posOffset>
@@ -172,7 +183,7 @@
             <wp:extent cx="6331585" cy="4983480"/>
             <wp:effectExtent l="19050" t="19050" r="12065" b="26670"/>
             <wp:wrapTight wrapText="bothSides">
-              <wp:wrapPolygon>
+              <wp:wrapPolygon edited="0">
                 <wp:start x="-65" y="-83"/>
                 <wp:lineTo x="-65" y="21633"/>
                 <wp:lineTo x="21576" y="21633"/>
@@ -240,11 +251,13 @@
       </w:pPr>
       <w:r>
         <w:rPr>
-          <w:sz w:val="52"/>
-          <w:szCs w:val="52"/>
-        </w:rPr>
+          <w:noProof/>
+          <w:sz w:val="52"/>
+          <w:szCs w:val="52"/>
+        </w:rPr>
+        <w:lastRenderedPageBreak/>
         <w:drawing>
-          <wp:anchor distT="0" distB="0" distL="114300" distR="114300" simplePos="0" relativeHeight="251661312" behindDoc="1" locked="0" layoutInCell="1" allowOverlap="1">
+          <wp:anchor distT="0" distB="0" distL="114300" distR="114300" simplePos="0" relativeHeight="251661312" behindDoc="1" locked="0" layoutInCell="1" allowOverlap="1" wp14:anchorId="10BC20D3" wp14:editId="1C43FD85">
             <wp:simplePos x="0" y="0"/>
             <wp:positionH relativeFrom="column">
               <wp:posOffset>-401320</wp:posOffset>
@@ -255,7 +268,7 @@
             <wp:extent cx="6955155" cy="2552700"/>
             <wp:effectExtent l="19050" t="19050" r="17145" b="19050"/>
             <wp:wrapTight wrapText="bothSides">
-              <wp:wrapPolygon>
+              <wp:wrapPolygon edited="0">
                 <wp:start x="-59" y="-161"/>
                 <wp:lineTo x="-59" y="21600"/>
                 <wp:lineTo x="21594" y="21600"/>
@@ -310,11 +323,12 @@
       </w:r>
       <w:r>
         <w:rPr>
+          <w:noProof/>
           <w:sz w:val="52"/>
           <w:szCs w:val="52"/>
         </w:rPr>
         <w:drawing>
-          <wp:inline distT="0" distB="0" distL="0" distR="0">
+          <wp:inline distT="0" distB="0" distL="0" distR="0" wp14:anchorId="77619A00" wp14:editId="765DE529">
             <wp:extent cx="6979920" cy="4837430"/>
             <wp:effectExtent l="19050" t="19050" r="11430" b="20320"/>
             <wp:docPr id="1745730348" name="Image 1"/>
@@ -376,11 +390,13 @@
       </w:pPr>
       <w:r>
         <w:rPr>
-          <w:sz w:val="52"/>
-          <w:szCs w:val="52"/>
-        </w:rPr>
+          <w:noProof/>
+          <w:sz w:val="52"/>
+          <w:szCs w:val="52"/>
+        </w:rPr>
+        <w:lastRenderedPageBreak/>
         <w:drawing>
-          <wp:inline distT="0" distB="0" distL="0" distR="0">
+          <wp:inline distT="0" distB="0" distL="0" distR="0" wp14:anchorId="0B2D5D25" wp14:editId="665B02AC">
             <wp:extent cx="5760720" cy="6091555"/>
             <wp:effectExtent l="19050" t="19050" r="11430" b="23495"/>
             <wp:docPr id="227914611" name="Image 1"/>
@@ -436,11 +452,13 @@
       </w:pPr>
       <w:r>
         <w:rPr>
-          <w:sz w:val="52"/>
-          <w:szCs w:val="52"/>
-        </w:rPr>
+          <w:noProof/>
+          <w:sz w:val="52"/>
+          <w:szCs w:val="52"/>
+        </w:rPr>
+        <w:lastRenderedPageBreak/>
         <w:drawing>
-          <wp:anchor distT="0" distB="0" distL="114300" distR="114300" simplePos="0" relativeHeight="251662336" behindDoc="1" locked="0" layoutInCell="1" allowOverlap="1">
+          <wp:anchor distT="0" distB="0" distL="114300" distR="114300" simplePos="0" relativeHeight="251662336" behindDoc="1" locked="0" layoutInCell="1" allowOverlap="1" wp14:anchorId="4C825D18" wp14:editId="403A4F0A">
             <wp:simplePos x="0" y="0"/>
             <wp:positionH relativeFrom="column">
               <wp:posOffset>-358140</wp:posOffset>
@@ -451,7 +469,7 @@
             <wp:extent cx="5760720" cy="5166995"/>
             <wp:effectExtent l="19050" t="19050" r="11430" b="14605"/>
             <wp:wrapTight wrapText="bothSides">
-              <wp:wrapPolygon>
+              <wp:wrapPolygon edited="0">
                 <wp:start x="-71" y="-80"/>
                 <wp:lineTo x="-71" y="21581"/>
                 <wp:lineTo x="21571" y="21581"/>
@@ -584,11 +602,13 @@
       </w:pPr>
       <w:r>
         <w:rPr>
-          <w:sz w:val="52"/>
-          <w:szCs w:val="52"/>
-        </w:rPr>
+          <w:noProof/>
+          <w:sz w:val="52"/>
+          <w:szCs w:val="52"/>
+        </w:rPr>
+        <w:lastRenderedPageBreak/>
         <w:drawing>
-          <wp:anchor distT="0" distB="0" distL="114300" distR="114300" simplePos="0" relativeHeight="251663360" behindDoc="1" locked="0" layoutInCell="1" allowOverlap="1">
+          <wp:anchor distT="0" distB="0" distL="114300" distR="114300" simplePos="0" relativeHeight="251663360" behindDoc="1" locked="0" layoutInCell="1" allowOverlap="1" wp14:anchorId="17F70D00" wp14:editId="7BBA6EB8">
             <wp:simplePos x="0" y="0"/>
             <wp:positionH relativeFrom="margin">
               <wp:align>center</wp:align>
@@ -599,7 +619,7 @@
             <wp:extent cx="7254240" cy="1595755"/>
             <wp:effectExtent l="19050" t="19050" r="23495" b="23495"/>
             <wp:wrapTight wrapText="bothSides">
-              <wp:wrapPolygon>
+              <wp:wrapPolygon edited="0">
                 <wp:start x="-57" y="-258"/>
                 <wp:lineTo x="-57" y="21660"/>
                 <wp:lineTo x="21613" y="21660"/>
@@ -654,11 +674,12 @@
       </w:r>
       <w:r>
         <w:rPr>
+          <w:noProof/>
           <w:sz w:val="52"/>
           <w:szCs w:val="52"/>
         </w:rPr>
         <w:drawing>
-          <wp:inline distT="0" distB="0" distL="0" distR="0">
+          <wp:inline distT="0" distB="0" distL="0" distR="0" wp14:anchorId="3A36921D" wp14:editId="5A903362">
             <wp:extent cx="6147435" cy="2196465"/>
             <wp:effectExtent l="19050" t="19050" r="24765" b="13335"/>
             <wp:docPr id="2090474191" name="Image 1"/>
@@ -710,18 +731,18 @@
         <w:rPr>
           <w:sz w:val="52"/>
           <w:szCs w:val="52"/>
-          <w:rtl/>
-        </w:rPr>
-      </w:pPr>
-      <w:r>
-        <w:rPr>
+        </w:rPr>
+      </w:pPr>
+      <w:r>
+        <w:rPr>
+          <w:noProof/>
           <w:sz w:val="52"/>
           <w:szCs w:val="52"/>
         </w:rPr>
         <mc:AlternateContent>
           <mc:Choice Requires="wpg">
             <w:drawing>
-              <wp:anchor distT="0" distB="0" distL="114300" distR="114300" simplePos="0" relativeHeight="251664384" behindDoc="0" locked="0" layoutInCell="1" allowOverlap="1">
+              <wp:anchor distT="0" distB="0" distL="114300" distR="114300" simplePos="0" relativeHeight="251664384" behindDoc="0" locked="0" layoutInCell="1" allowOverlap="1" wp14:anchorId="69101010" wp14:editId="2845315F">
                 <wp:simplePos x="0" y="0"/>
                 <wp:positionH relativeFrom="margin">
                   <wp:posOffset>-488315</wp:posOffset>
@@ -869,21 +890,36 @@
           </mc:Choice>
           <mc:Fallback>
             <w:pict>
-              <v:group id="Groupe 5" o:spid="_x0000_s1026" o:spt="203" style="position:absolute;left:0pt;margin-left:-38.45pt;margin-top:183.6pt;height:131.3pt;width:539.9pt;mso-position-horizontal-relative:margin;z-index:251664384;mso-width-relative:page;mso-height-relative:page;" coordsize="5760720,1220470" o:gfxdata="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">
-                <o:lock v:ext="edit" aspectratio="f"/>
-                <v:group id="Groupe 4" o:spid="_x0000_s1026" o:spt="203" style="position:absolute;left:0;top:0;height:1220470;width:5760720;" coordsize="5760720,1220470" o:gfxdata="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">
-                  <o:lock v:ext="edit" aspectratio="f"/>
-                  <v:shape id="Image 1" o:spid="_x0000_s1026" o:spt="75" type="#_x0000_t75" style="position:absolute;left:0;top:0;height:1220470;width:5760720;" filled="f" o:preferrelative="t" stroked="t" coordsize="21600,21600" o:gfxdata="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">
-                    <v:fill on="f" focussize="0,0"/>
-                    <v:stroke weight="1.5pt" color="#000000 [3213]" joinstyle="round"/>
-                    <v:imagedata r:id="rId15" o:title=""/>
+              <v:group w14:anchorId="69101010" id="Groupe 5" o:spid="_x0000_s1026" style="position:absolute;left:0;text-align:left;margin-left:-38.45pt;margin-top:183.6pt;width:539.9pt;height:131.3pt;z-index:251664384;mso-position-horizontal-relative:margin" coordsize="57607,12204" o:gfxdata="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">
+                <v:group id="Groupe 4" o:spid="_x0000_s1027" style="position:absolute;width:57607;height:12204" coordsize="57607,12204" o:gfxdata="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">
+                  <v:shapetype id="_x0000_t75" coordsize="21600,21600" o:spt="75" o:preferrelative="t" path="m@4@5l@4@11@9@11@9@5xe" filled="f" stroked="f">
+                    <v:stroke joinstyle="miter"/>
+                    <v:formulas>
+                      <v:f eqn="if lineDrawn pixelLineWidth 0"/>
+                      <v:f eqn="sum @0 1 0"/>
+                      <v:f eqn="sum 0 0 @1"/>
+                      <v:f eqn="prod @2 1 2"/>
+                      <v:f eqn="prod @3 21600 pixelWidth"/>
+                      <v:f eqn="prod @3 21600 pixelHeight"/>
+                      <v:f eqn="sum @0 0 1"/>
+                      <v:f eqn="prod @6 1 2"/>
+                      <v:f eqn="prod @7 21600 pixelWidth"/>
+                      <v:f eqn="sum @8 21600 0"/>
+                      <v:f eqn="prod @7 21600 pixelHeight"/>
+                      <v:f eqn="sum @10 21600 0"/>
+                    </v:formulas>
+                    <v:path o:extrusionok="f" gradientshapeok="t" o:connecttype="rect"/>
                     <o:lock v:ext="edit" aspectratio="t"/>
+                  </v:shapetype>
+                  <v:shape id="Image 1" o:spid="_x0000_s1028" type="#_x0000_t75" style="position:absolute;width:57607;height:12204;visibility:visible;mso-wrap-style:square" o:gfxdata="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" stroked="t" strokecolor="black [3213]" strokeweight="1.5pt">
+                    <v:imagedata r:id="rId16" o:title=""/>
+                    <v:path arrowok="t"/>
                   </v:shape>
-                  <v:shape id="Zone de texte 2" o:spid="_x0000_s1026" o:spt="202" type="#_x0000_t202" style="position:absolute;left:225631;top:95003;height:522514;width:5450774;" filled="f" stroked="t" coordsize="21600,21600" o:gfxdata="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">
-                    <v:fill on="f" focussize="0,0"/>
-                    <v:stroke weight="2.25pt" color="#EE0000" joinstyle="round"/>
-                    <v:imagedata o:title=""/>
-                    <o:lock v:ext="edit" aspectratio="f"/>
+                  <v:shapetype id="_x0000_t202" coordsize="21600,21600" o:spt="202" path="m,l,21600r21600,l21600,xe">
+                    <v:stroke joinstyle="miter"/>
+                    <v:path gradientshapeok="t" o:connecttype="rect"/>
+                  </v:shapetype>
+                  <v:shape id="Zone de texte 2" o:spid="_x0000_s1029" type="#_x0000_t202" style="position:absolute;left:2256;top:950;width:54508;height:5225;visibility:visible;mso-wrap-style:square;v-text-anchor:top" o:gfxdata="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" filled="f" strokecolor="#e00" strokeweight="2.25pt">
                     <v:textbox>
                       <w:txbxContent>
                         <w:p/>
@@ -891,11 +927,7 @@
                     </v:textbox>
                   </v:shape>
                 </v:group>
-                <v:shape id="Zone de texte 3" o:spid="_x0000_s1026" o:spt="202" type="#_x0000_t202" style="position:absolute;left:4265672;top:360016;height:308652;width:1213170;mso-wrap-style:none;" filled="f" stroked="f" coordsize="21600,21600" o:gfxdata="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">
-                  <v:fill on="f" focussize="0,0"/>
-                  <v:stroke on="f" weight="0.5pt"/>
-                  <v:imagedata o:title=""/>
-                  <o:lock v:ext="edit" aspectratio="f"/>
+                <v:shape id="Zone de texte 3" o:spid="_x0000_s1030" type="#_x0000_t202" style="position:absolute;left:42656;top:3600;width:12132;height:3086;visibility:visible;mso-wrap-style:none;v-text-anchor:top" o:gfxdata="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" filled="f" stroked="f" strokeweight=".5pt">
                   <v:textbox>
                     <w:txbxContent>
                       <w:p>
@@ -919,6 +951,7 @@
                     </w:txbxContent>
                   </v:textbox>
                 </v:shape>
+                <w10:wrap anchorx="margin"/>
               </v:group>
             </w:pict>
           </mc:Fallback>
@@ -927,6 +960,203 @@
     </w:p>
     <w:p>
       <w:pPr>
+        <w:rPr>
+          <w:sz w:val="52"/>
+          <w:szCs w:val="52"/>
+        </w:rPr>
+      </w:pPr>
+    </w:p>
+    <w:p>
+      <w:pPr>
+        <w:rPr>
+          <w:sz w:val="52"/>
+          <w:szCs w:val="52"/>
+        </w:rPr>
+      </w:pPr>
+    </w:p>
+    <w:p>
+      <w:pPr>
+        <w:rPr>
+          <w:sz w:val="52"/>
+          <w:szCs w:val="52"/>
+        </w:rPr>
+      </w:pPr>
+    </w:p>
+    <w:p>
+      <w:pPr>
+        <w:tabs>
+          <w:tab w:val="left" w:pos="7069"/>
+        </w:tabs>
+        <w:ind w:left="-964"/>
+        <w:jc w:val="center"/>
+        <w:rPr>
+          <w:b/>
+          <w:bCs/>
+          <w:sz w:val="52"/>
+          <w:szCs w:val="52"/>
+        </w:rPr>
+      </w:pPr>
+      <w:r>
+        <w:rPr>
+          <w:b/>
+          <w:bCs/>
+          <w:sz w:val="52"/>
+          <w:szCs w:val="52"/>
+        </w:rPr>
+        <w:t>Rappel sur les coordonnées sphérique</w:t>
+      </w:r>
+    </w:p>
+    <w:p>
+      <w:pPr>
+        <w:ind w:left="-397"/>
+        <w:jc w:val="center"/>
+        <w:rPr>
+          <w:sz w:val="52"/>
+          <w:szCs w:val="52"/>
+        </w:rPr>
+      </w:pPr>
+      <w:r>
+        <w:rPr>
+          <w:sz w:val="52"/>
+          <w:szCs w:val="52"/>
+        </w:rPr>
+        <w:lastRenderedPageBreak/>
+        <w:drawing>
+          <wp:anchor distT="0" distB="0" distL="114300" distR="114300" simplePos="0" relativeHeight="251665408" behindDoc="1" locked="0" layoutInCell="1" allowOverlap="1" wp14:anchorId="020DE442" wp14:editId="699AE3F0">
+            <wp:simplePos x="0" y="0"/>
+            <wp:positionH relativeFrom="margin">
+              <wp:align>left</wp:align>
+            </wp:positionH>
+            <wp:positionV relativeFrom="paragraph">
+              <wp:posOffset>3745189</wp:posOffset>
+            </wp:positionV>
+            <wp:extent cx="5426710" cy="4459605"/>
+            <wp:effectExtent l="0" t="0" r="2540" b="0"/>
+            <wp:wrapTight wrapText="bothSides">
+              <wp:wrapPolygon edited="0">
+                <wp:start x="0" y="0"/>
+                <wp:lineTo x="0" y="21499"/>
+                <wp:lineTo x="21534" y="21499"/>
+                <wp:lineTo x="21534" y="0"/>
+                <wp:lineTo x="0" y="0"/>
+              </wp:wrapPolygon>
+            </wp:wrapTight>
+            <wp:docPr id="6418123" name="Image 1"/>
+            <wp:cNvGraphicFramePr>
+              <a:graphicFrameLocks xmlns:a="http://schemas.openxmlformats.org/drawingml/2006/main" noChangeAspect="1"/>
+            </wp:cNvGraphicFramePr>
+            <a:graphic xmlns:a="http://schemas.openxmlformats.org/drawingml/2006/main">
+              <a:graphicData uri="http://schemas.openxmlformats.org/drawingml/2006/picture">
+                <pic:pic xmlns:pic="http://schemas.openxmlformats.org/drawingml/2006/picture">
+                  <pic:nvPicPr>
+                    <pic:cNvPr id="6418123" name=""/>
+                    <pic:cNvPicPr/>
+                  </pic:nvPicPr>
+                  <pic:blipFill>
+                    <a:blip r:embed="rId17">
+                      <a:extLst>
+                        <a:ext uri="{28A0092B-C50C-407E-A947-70E740481C1C}">
+                          <a14:useLocalDpi xmlns:a14="http://schemas.microsoft.com/office/drawing/2010/main" val="0"/>
+                        </a:ext>
+                      </a:extLst>
+                    </a:blip>
+                    <a:stretch>
+                      <a:fillRect/>
+                    </a:stretch>
+                  </pic:blipFill>
+                  <pic:spPr>
+                    <a:xfrm>
+                      <a:off x="0" y="0"/>
+                      <a:ext cx="5436217" cy="4467696"/>
+                    </a:xfrm>
+                    <a:prstGeom prst="rect">
+                      <a:avLst/>
+                    </a:prstGeom>
+                  </pic:spPr>
+                </pic:pic>
+              </a:graphicData>
+            </a:graphic>
+            <wp14:sizeRelH relativeFrom="margin">
+              <wp14:pctWidth>0</wp14:pctWidth>
+            </wp14:sizeRelH>
+            <wp14:sizeRelV relativeFrom="margin">
+              <wp14:pctHeight>0</wp14:pctHeight>
+            </wp14:sizeRelV>
+          </wp:anchor>
+        </w:drawing>
+      </w:r>
+      <w:r>
+        <w:rPr>
+          <w:sz w:val="52"/>
+          <w:szCs w:val="52"/>
+        </w:rPr>
+        <w:drawing>
+          <wp:inline distT="0" distB="0" distL="0" distR="0" wp14:anchorId="704161BB" wp14:editId="545139B5">
+            <wp:extent cx="6592355" cy="3610099"/>
+            <wp:effectExtent l="0" t="0" r="0" b="0"/>
+            <wp:docPr id="2039269561" name="Image 1"/>
+            <wp:cNvGraphicFramePr>
+              <a:graphicFrameLocks xmlns:a="http://schemas.openxmlformats.org/drawingml/2006/main" noChangeAspect="1"/>
+            </wp:cNvGraphicFramePr>
+            <a:graphic xmlns:a="http://schemas.openxmlformats.org/drawingml/2006/main">
+              <a:graphicData uri="http://schemas.openxmlformats.org/drawingml/2006/picture">
+                <pic:pic xmlns:pic="http://schemas.openxmlformats.org/drawingml/2006/picture">
+                  <pic:nvPicPr>
+                    <pic:cNvPr id="2039269561" name=""/>
+                    <pic:cNvPicPr/>
+                  </pic:nvPicPr>
+                  <pic:blipFill>
+                    <a:blip r:embed="rId18"/>
+                    <a:stretch>
+                      <a:fillRect/>
+                    </a:stretch>
+                  </pic:blipFill>
+                  <pic:spPr>
+                    <a:xfrm>
+                      <a:off x="0" y="0"/>
+                      <a:ext cx="6600474" cy="3614545"/>
+                    </a:xfrm>
+                    <a:prstGeom prst="rect">
+                      <a:avLst/>
+                    </a:prstGeom>
+                  </pic:spPr>
+                </pic:pic>
+              </a:graphicData>
+            </a:graphic>
+          </wp:inline>
+        </w:drawing>
+      </w:r>
+    </w:p>
+    <w:p>
+      <w:pPr>
+        <w:rPr>
+          <w:sz w:val="52"/>
+          <w:szCs w:val="52"/>
+        </w:rPr>
+      </w:pPr>
+    </w:p>
+    <w:p>
+      <w:pPr>
+        <w:tabs>
+          <w:tab w:val="left" w:pos="2282"/>
+        </w:tabs>
+        <w:rPr>
+          <w:sz w:val="52"/>
+          <w:szCs w:val="52"/>
+          <w:rtl/>
+        </w:rPr>
+      </w:pPr>
+      <w:r>
+        <w:rPr>
+          <w:sz w:val="52"/>
+          <w:szCs w:val="52"/>
+        </w:rPr>
+        <w:lastRenderedPageBreak/>
+        <w:tab/>
+      </w:r>
+    </w:p>
+    <w:p>
+      <w:pPr>
         <w:tabs>
           <w:tab w:val="left" w:pos="2469"/>
         </w:tabs>
@@ -939,11 +1169,12 @@
       </w:pPr>
       <w:r>
         <w:rPr>
+          <w:noProof/>
           <w:sz w:val="52"/>
           <w:szCs w:val="52"/>
         </w:rPr>
         <w:drawing>
-          <wp:inline distT="0" distB="0" distL="0" distR="0">
+          <wp:inline distT="0" distB="0" distL="0" distR="0" wp14:anchorId="0183D126" wp14:editId="38FB44CB">
             <wp:extent cx="6923405" cy="5759450"/>
             <wp:effectExtent l="19050" t="19050" r="10795" b="12700"/>
             <wp:docPr id="1894656108" name="Image 1"/>
@@ -960,7 +1191,7 @@
                     </pic:cNvPicPr>
                   </pic:nvPicPr>
                   <pic:blipFill>
-                    <a:blip r:embed="rId16">
+                    <a:blip r:embed="rId19">
                       <a:extLst>
                         <a:ext uri="{28A0092B-C50C-407E-A947-70E740481C1C}">
                           <a14:useLocalDpi xmlns:a14="http://schemas.microsoft.com/office/drawing/2010/main" val="0"/>
@@ -1007,13 +1238,74 @@
     <w:p>
       <w:pPr>
         <w:tabs>
-          <w:tab w:val="left" w:pos="2469"/>
+          <w:tab w:val="left" w:pos="6059"/>
         </w:tabs>
         <w:rPr>
           <w:sz w:val="52"/>
           <w:szCs w:val="52"/>
         </w:rPr>
       </w:pPr>
+      <w:r>
+        <w:rPr>
+          <w:sz w:val="52"/>
+          <w:szCs w:val="52"/>
+        </w:rPr>
+        <w:lastRenderedPageBreak/>
+        <w:tab/>
+      </w:r>
+      <w:r>
+        <w:rPr>
+          <w:noProof/>
+        </w:rPr>
+        <w:drawing>
+          <wp:inline distT="0" distB="0" distL="0" distR="0" wp14:anchorId="6D64FDC8" wp14:editId="25EFCA5A">
+            <wp:extent cx="3182587" cy="1802914"/>
+            <wp:effectExtent l="0" t="0" r="0" b="6985"/>
+            <wp:docPr id="59697433" name="Image 3" descr="Summary of Trigonometric Identities – Engr Edu"/>
+            <wp:cNvGraphicFramePr>
+              <a:graphicFrameLocks xmlns:a="http://schemas.openxmlformats.org/drawingml/2006/main" noChangeAspect="1"/>
+            </wp:cNvGraphicFramePr>
+            <a:graphic xmlns:a="http://schemas.openxmlformats.org/drawingml/2006/main">
+              <a:graphicData uri="http://schemas.openxmlformats.org/drawingml/2006/picture">
+                <pic:pic xmlns:pic="http://schemas.openxmlformats.org/drawingml/2006/picture">
+                  <pic:nvPicPr>
+                    <pic:cNvPr id="0" name="Picture 1" descr="Summary of Trigonometric Identities – Engr Edu"/>
+                    <pic:cNvPicPr>
+                      <a:picLocks noChangeAspect="1" noChangeArrowheads="1"/>
+                    </pic:cNvPicPr>
+                  </pic:nvPicPr>
+                  <pic:blipFill>
+                    <a:blip r:embed="rId20">
+                      <a:extLst>
+                        <a:ext uri="{28A0092B-C50C-407E-A947-70E740481C1C}">
+                          <a14:useLocalDpi xmlns:a14="http://schemas.microsoft.com/office/drawing/2010/main" val="0"/>
+                        </a:ext>
+                      </a:extLst>
+                    </a:blip>
+                    <a:srcRect/>
+                    <a:stretch>
+                      <a:fillRect/>
+                    </a:stretch>
+                  </pic:blipFill>
+                  <pic:spPr bwMode="auto">
+                    <a:xfrm>
+                      <a:off x="0" y="0"/>
+                      <a:ext cx="3192822" cy="1808712"/>
+                    </a:xfrm>
+                    <a:prstGeom prst="rect">
+                      <a:avLst/>
+                    </a:prstGeom>
+                    <a:noFill/>
+                    <a:ln>
+                      <a:noFill/>
+                    </a:ln>
+                  </pic:spPr>
+                </pic:pic>
+              </a:graphicData>
+            </a:graphic>
+          </wp:inline>
+        </w:drawing>
+      </w:r>
     </w:p>
     <w:p>
       <w:pPr>
@@ -1025,6 +1317,29 @@
           <w:szCs w:val="52"/>
         </w:rPr>
       </w:pPr>
+      <w:r>
+        <w:rPr>
+          <w:rFonts w:ascii="Rockwell" w:eastAsia="SimSun" w:hAnsi="Rockwell" w:cs="Rockwell"/>
+          <w:b/>
+          <w:bCs/>
+        </w:rPr>
+        <w:t>Pour bien comprendre la solution de l’exercice 03 (hémisphère), veuillez consulter la vidéo explicative suivante :</w:t>
+      </w:r>
+      <w:r>
+        <w:rPr>
+          <w:rFonts w:ascii="SimSun" w:eastAsia="SimSun" w:hAnsi="SimSun" w:cs="SimSun"/>
+        </w:rPr>
+        <w:br/>
+      </w:r>
+      <w:hyperlink r:id="rId21" w:history="1">
+        <w:r>
+          <w:rPr>
+            <w:rStyle w:val="Lienhypertexte"/>
+            <w:rFonts w:ascii="SimSun" w:eastAsia="SimSun" w:hAnsi="SimSun" w:cs="SimSun"/>
+          </w:rPr>
+          <w:t>https://youtu.be/L763k6zkCkM?si=sL9HvLihMffPgAPk</w:t>
+        </w:r>
+      </w:hyperlink>
     </w:p>
     <w:p>
       <w:pPr>
@@ -1036,101 +1351,12 @@
           <w:szCs w:val="52"/>
         </w:rPr>
       </w:pPr>
-    </w:p>
-    <w:p>
-      <w:pPr>
-        <w:tabs>
-          <w:tab w:val="left" w:pos="2469"/>
-        </w:tabs>
-        <w:rPr>
-          <w:sz w:val="52"/>
-          <w:szCs w:val="52"/>
-        </w:rPr>
-      </w:pPr>
-    </w:p>
-    <w:p>
-      <w:pPr>
-        <w:tabs>
-          <w:tab w:val="left" w:pos="2469"/>
-        </w:tabs>
-        <w:rPr>
-          <w:sz w:val="52"/>
-          <w:szCs w:val="52"/>
-        </w:rPr>
-      </w:pPr>
-      <w:r>
-        <w:rPr>
-          <w:rFonts w:hint="default" w:ascii="Rockwell" w:hAnsi="Rockwell" w:eastAsia="SimSun" w:cs="Rockwell"/>
-          <w:b/>
-          <w:bCs/>
-          <w:sz w:val="24"/>
-          <w:szCs w:val="24"/>
-        </w:rPr>
-        <w:t>Pour bien comprendre la solution de l’exercice 03 (hémisphère), veuillez consulter la vidéo explicative suivante :</w:t>
-      </w:r>
-      <w:r>
-        <w:rPr>
-          <w:rFonts w:ascii="SimSun" w:hAnsi="SimSun" w:eastAsia="SimSun" w:cs="SimSun"/>
-          <w:sz w:val="24"/>
-          <w:szCs w:val="24"/>
-        </w:rPr>
-        <w:br w:type="textWrapping"/>
-      </w:r>
-      <w:r>
-        <w:rPr>
-          <w:rFonts w:ascii="SimSun" w:hAnsi="SimSun" w:eastAsia="SimSun" w:cs="SimSun"/>
-          <w:sz w:val="24"/>
-          <w:szCs w:val="24"/>
-        </w:rPr>
-        <w:fldChar w:fldCharType="begin"/>
-      </w:r>
-      <w:r>
-        <w:rPr>
-          <w:rFonts w:ascii="SimSun" w:hAnsi="SimSun" w:eastAsia="SimSun" w:cs="SimSun"/>
-          <w:sz w:val="24"/>
-          <w:szCs w:val="24"/>
-        </w:rPr>
-        <w:instrText xml:space="preserve"> HYPERLINK "https://youtu.be/L763k6zkCkM?si=sL9HvLihMffPgAPk" </w:instrText>
-      </w:r>
-      <w:r>
-        <w:rPr>
-          <w:rFonts w:ascii="SimSun" w:hAnsi="SimSun" w:eastAsia="SimSun" w:cs="SimSun"/>
-          <w:sz w:val="24"/>
-          <w:szCs w:val="24"/>
-        </w:rPr>
-        <w:fldChar w:fldCharType="separate"/>
-      </w:r>
-      <w:r>
-        <w:rPr>
-          <w:rStyle w:val="12"/>
-          <w:rFonts w:ascii="SimSun" w:hAnsi="SimSun" w:eastAsia="SimSun" w:cs="SimSun"/>
-          <w:sz w:val="24"/>
-          <w:szCs w:val="24"/>
-        </w:rPr>
-        <w:t>https://youtu.be/L763k6zkCkM?si=sL9HvLihMffPgAPk</w:t>
-      </w:r>
-      <w:r>
-        <w:rPr>
-          <w:rFonts w:ascii="SimSun" w:hAnsi="SimSun" w:eastAsia="SimSun" w:cs="SimSun"/>
-          <w:sz w:val="24"/>
-          <w:szCs w:val="24"/>
-        </w:rPr>
-        <w:fldChar w:fldCharType="end"/>
-      </w:r>
-    </w:p>
-    <w:p>
-      <w:pPr>
-        <w:tabs>
-          <w:tab w:val="left" w:pos="2469"/>
-        </w:tabs>
-        <w:rPr>
-          <w:sz w:val="52"/>
-          <w:szCs w:val="52"/>
-        </w:rPr>
-      </w:pPr>
-      <w:r>
+      <w:r>
+        <w:rPr>
+          <w:noProof/>
+        </w:rPr>
         <w:drawing>
-          <wp:inline distT="0" distB="0" distL="114300" distR="114300">
+          <wp:inline distT="0" distB="0" distL="114300" distR="114300" wp14:anchorId="1A8AFD1C" wp14:editId="611CE68C">
             <wp:extent cx="5210175" cy="4629150"/>
             <wp:effectExtent l="0" t="0" r="9525" b="0"/>
             <wp:docPr id="1" name="Image 1"/>
@@ -1147,7 +1373,7 @@
                     </pic:cNvPicPr>
                   </pic:nvPicPr>
                   <pic:blipFill>
-                    <a:blip r:embed="rId17"/>
+                    <a:blip r:embed="rId22"/>
                     <a:stretch>
                       <a:fillRect/>
                     </a:stretch>
@@ -1174,13 +1400,8 @@
     </w:p>
     <w:p>
       <w:pPr>
-        <w:pStyle w:val="14"/>
-        <w:keepNext w:val="0"/>
-        <w:keepLines w:val="0"/>
-        <w:widowControl/>
-        <w:suppressLineNumbers w:val="0"/>
-        <w:rPr>
-          <w:rFonts w:hint="default"/>
+        <w:pStyle w:val="NormalWeb"/>
+        <w:rPr>
           <w:b/>
           <w:bCs/>
           <w:highlight w:val="yellow"/>
@@ -1189,7 +1410,6 @@
       </w:pPr>
       <w:r>
         <w:rPr>
-          <w:rFonts w:hint="default"/>
           <w:b/>
           <w:bCs/>
           <w:highlight w:val="yellow"/>
@@ -1200,35 +1420,202 @@
     </w:p>
     <w:p>
       <w:pPr>
-        <w:pStyle w:val="14"/>
-        <w:keepNext w:val="0"/>
-        <w:keepLines w:val="0"/>
-        <w:widowControl/>
-        <w:suppressLineNumbers w:val="0"/>
-      </w:pPr>
-      <w:r>
-        <w:t>Pour la solution de l’exercice 04 (centre d’inertie – théorème de Guldin), veuillez consulter la vidéo explicative suivante :</w:t>
-      </w:r>
-      <w:r>
-        <w:br w:type="textWrapping"/>
-      </w:r>
-      <w:r>
-        <w:fldChar w:fldCharType="begin"/>
-      </w:r>
-      <w:r>
-        <w:instrText xml:space="preserve"> HYPERLINK "https://youtu.be/ZXXCYlkxwC8?si=FuXJRCMCDl6-laIN" </w:instrText>
-      </w:r>
-      <w:r>
-        <w:fldChar w:fldCharType="separate"/>
-      </w:r>
-      <w:r>
-        <w:rPr>
-          <w:rStyle w:val="12"/>
-        </w:rPr>
-        <w:t>https://youtu.be/ZXXCYlkxwC8?si=FuXJRCMCDl6-laIN</w:t>
-      </w:r>
-      <w:r>
-        <w:fldChar w:fldCharType="end"/>
+        <w:pStyle w:val="NormalWeb"/>
+      </w:pPr>
+      <w:r>
+        <w:lastRenderedPageBreak/>
+        <w:t xml:space="preserve">Pour la solution de </w:t>
+      </w:r>
+      <w:proofErr w:type="spellStart"/>
+      <w:r>
+        <w:t>l’exercice</w:t>
+      </w:r>
+      <w:proofErr w:type="spellEnd"/>
+      <w:r>
+        <w:t xml:space="preserve"> 04 (</w:t>
+      </w:r>
+      <w:proofErr w:type="spellStart"/>
+      <w:r>
+        <w:t>centre</w:t>
+      </w:r>
+      <w:proofErr w:type="spellEnd"/>
+      <w:r>
+        <w:t xml:space="preserve"> </w:t>
+      </w:r>
+      <w:proofErr w:type="spellStart"/>
+      <w:r>
+        <w:t>d’inertie</w:t>
+      </w:r>
+      <w:proofErr w:type="spellEnd"/>
+      <w:r>
+        <w:t xml:space="preserve"> – </w:t>
+      </w:r>
+      <w:proofErr w:type="spellStart"/>
+      <w:r>
+        <w:t>théorème</w:t>
+      </w:r>
+      <w:proofErr w:type="spellEnd"/>
+      <w:r>
+        <w:t xml:space="preserve"> de Guldin), </w:t>
+      </w:r>
+      <w:proofErr w:type="spellStart"/>
+      <w:r>
+        <w:t>veuillez</w:t>
+      </w:r>
+      <w:proofErr w:type="spellEnd"/>
+      <w:r>
+        <w:t xml:space="preserve"> consulter la </w:t>
+      </w:r>
+      <w:proofErr w:type="spellStart"/>
+      <w:r>
+        <w:t>vidéo</w:t>
+      </w:r>
+      <w:proofErr w:type="spellEnd"/>
+      <w:r>
+        <w:t xml:space="preserve"> explicative </w:t>
+      </w:r>
+      <w:proofErr w:type="spellStart"/>
+      <w:proofErr w:type="gramStart"/>
+      <w:r>
+        <w:t>suivante</w:t>
+      </w:r>
+      <w:proofErr w:type="spellEnd"/>
+      <w:r>
+        <w:t xml:space="preserve"> :</w:t>
+      </w:r>
+      <w:proofErr w:type="gramEnd"/>
+      <w:r>
+        <w:br/>
+      </w:r>
+      <w:hyperlink r:id="rId23" w:history="1">
+        <w:r>
+          <w:rPr>
+            <w:rStyle w:val="Lienhypertexte"/>
+          </w:rPr>
+          <w:t>https://youtu.be/ZXXCYlkxwC8?si=FuXJRCMCDl6-laIN</w:t>
+        </w:r>
+      </w:hyperlink>
+    </w:p>
+    <w:p>
+      <w:pPr>
+        <w:pStyle w:val="NormalWeb"/>
+        <w:jc w:val="center"/>
+        <w:rPr>
+          <w:color w:val="EE0000"/>
+          <w:sz w:val="36"/>
+          <w:szCs w:val="36"/>
+        </w:rPr>
+      </w:pPr>
+      <w:r>
+        <w:rPr>
+          <w:sz w:val="52"/>
+          <w:szCs w:val="52"/>
+        </w:rPr>
+        <w:drawing>
+          <wp:anchor distT="0" distB="0" distL="114300" distR="114300" simplePos="0" relativeHeight="251666432" behindDoc="1" locked="0" layoutInCell="1" allowOverlap="1" wp14:anchorId="7F3AB4E4" wp14:editId="3BA3DA86">
+            <wp:simplePos x="0" y="0"/>
+            <wp:positionH relativeFrom="column">
+              <wp:posOffset>417830</wp:posOffset>
+            </wp:positionH>
+            <wp:positionV relativeFrom="paragraph">
+              <wp:posOffset>404050</wp:posOffset>
+            </wp:positionV>
+            <wp:extent cx="4832985" cy="3456940"/>
+            <wp:effectExtent l="0" t="0" r="5715" b="0"/>
+            <wp:wrapTight wrapText="bothSides">
+              <wp:wrapPolygon edited="0">
+                <wp:start x="0" y="0"/>
+                <wp:lineTo x="0" y="21425"/>
+                <wp:lineTo x="21540" y="21425"/>
+                <wp:lineTo x="21540" y="0"/>
+                <wp:lineTo x="0" y="0"/>
+              </wp:wrapPolygon>
+            </wp:wrapTight>
+            <wp:docPr id="257416860" name="Image 1"/>
+            <wp:cNvGraphicFramePr>
+              <a:graphicFrameLocks xmlns:a="http://schemas.openxmlformats.org/drawingml/2006/main" noChangeAspect="1"/>
+            </wp:cNvGraphicFramePr>
+            <a:graphic xmlns:a="http://schemas.openxmlformats.org/drawingml/2006/main">
+              <a:graphicData uri="http://schemas.openxmlformats.org/drawingml/2006/picture">
+                <pic:pic xmlns:pic="http://schemas.openxmlformats.org/drawingml/2006/picture">
+                  <pic:nvPicPr>
+                    <pic:cNvPr id="257416860" name=""/>
+                    <pic:cNvPicPr/>
+                  </pic:nvPicPr>
+                  <pic:blipFill>
+                    <a:blip r:embed="rId24" cstate="print">
+                      <a:extLst>
+                        <a:ext uri="{28A0092B-C50C-407E-A947-70E740481C1C}">
+                          <a14:useLocalDpi xmlns:a14="http://schemas.microsoft.com/office/drawing/2010/main" val="0"/>
+                        </a:ext>
+                      </a:extLst>
+                    </a:blip>
+                    <a:stretch>
+                      <a:fillRect/>
+                    </a:stretch>
+                  </pic:blipFill>
+                  <pic:spPr>
+                    <a:xfrm>
+                      <a:off x="0" y="0"/>
+                      <a:ext cx="4832985" cy="3456940"/>
+                    </a:xfrm>
+                    <a:prstGeom prst="rect">
+                      <a:avLst/>
+                    </a:prstGeom>
+                  </pic:spPr>
+                </pic:pic>
+              </a:graphicData>
+            </a:graphic>
+            <wp14:sizeRelH relativeFrom="margin">
+              <wp14:pctWidth>0</wp14:pctWidth>
+            </wp14:sizeRelH>
+            <wp14:sizeRelV relativeFrom="margin">
+              <wp14:pctHeight>0</wp14:pctHeight>
+            </wp14:sizeRelV>
+          </wp:anchor>
+        </w:drawing>
+      </w:r>
+      <w:r>
+        <w:rPr>
+          <w:color w:val="EE0000"/>
+          <w:sz w:val="36"/>
+          <w:szCs w:val="36"/>
+        </w:rPr>
+        <w:t xml:space="preserve">Rappel sur </w:t>
+      </w:r>
+      <w:proofErr w:type="spellStart"/>
+      <w:r>
+        <w:rPr>
+          <w:color w:val="EE0000"/>
+          <w:sz w:val="36"/>
+          <w:szCs w:val="36"/>
+        </w:rPr>
+        <w:t>théo</w:t>
+      </w:r>
+      <w:r>
+        <w:rPr>
+          <w:color w:val="EE0000"/>
+          <w:sz w:val="36"/>
+          <w:szCs w:val="36"/>
+        </w:rPr>
+        <w:t>ré</w:t>
+      </w:r>
+      <w:r>
+        <w:rPr>
+          <w:color w:val="EE0000"/>
+          <w:sz w:val="36"/>
+          <w:szCs w:val="36"/>
+        </w:rPr>
+        <w:t>me</w:t>
+      </w:r>
+      <w:proofErr w:type="spellEnd"/>
+      <w:r>
+        <w:rPr>
+          <w:color w:val="EE0000"/>
+          <w:sz w:val="36"/>
+          <w:szCs w:val="36"/>
+        </w:rPr>
+        <w:t xml:space="preserve"> de Guldin</w:t>
       </w:r>
     </w:p>
     <w:p>
@@ -1241,23 +1628,454 @@
           <w:szCs w:val="52"/>
         </w:rPr>
       </w:pPr>
-      <w:bookmarkStart w:id="0" w:name="_GoBack"/>
-      <w:bookmarkEnd w:id="0"/>
+    </w:p>
+    <w:p>
+      <w:pPr>
+        <w:tabs>
+          <w:tab w:val="left" w:pos="7181"/>
+        </w:tabs>
+        <w:rPr>
+          <w:sz w:val="52"/>
+          <w:szCs w:val="52"/>
+        </w:rPr>
+      </w:pPr>
+      <w:r>
+        <w:rPr>
+          <w:sz w:val="52"/>
+          <w:szCs w:val="52"/>
+        </w:rPr>
+        <w:drawing>
+          <wp:anchor distT="0" distB="0" distL="114300" distR="114300" simplePos="0" relativeHeight="251667456" behindDoc="1" locked="0" layoutInCell="1" allowOverlap="1" wp14:anchorId="282F8831" wp14:editId="30B7938D">
+            <wp:simplePos x="0" y="0"/>
+            <wp:positionH relativeFrom="margin">
+              <wp:posOffset>275277</wp:posOffset>
+            </wp:positionH>
+            <wp:positionV relativeFrom="paragraph">
+              <wp:posOffset>2998049</wp:posOffset>
+            </wp:positionV>
+            <wp:extent cx="5305425" cy="3942080"/>
+            <wp:effectExtent l="0" t="0" r="9525" b="1270"/>
+            <wp:wrapTight wrapText="bothSides">
+              <wp:wrapPolygon edited="0">
+                <wp:start x="0" y="0"/>
+                <wp:lineTo x="0" y="21503"/>
+                <wp:lineTo x="21561" y="21503"/>
+                <wp:lineTo x="21561" y="0"/>
+                <wp:lineTo x="0" y="0"/>
+              </wp:wrapPolygon>
+            </wp:wrapTight>
+            <wp:docPr id="501080304" name="Image 1"/>
+            <wp:cNvGraphicFramePr>
+              <a:graphicFrameLocks xmlns:a="http://schemas.openxmlformats.org/drawingml/2006/main" noChangeAspect="1"/>
+            </wp:cNvGraphicFramePr>
+            <a:graphic xmlns:a="http://schemas.openxmlformats.org/drawingml/2006/main">
+              <a:graphicData uri="http://schemas.openxmlformats.org/drawingml/2006/picture">
+                <pic:pic xmlns:pic="http://schemas.openxmlformats.org/drawingml/2006/picture">
+                  <pic:nvPicPr>
+                    <pic:cNvPr id="501080304" name=""/>
+                    <pic:cNvPicPr/>
+                  </pic:nvPicPr>
+                  <pic:blipFill>
+                    <a:blip r:embed="rId25">
+                      <a:extLst>
+                        <a:ext uri="{28A0092B-C50C-407E-A947-70E740481C1C}">
+                          <a14:useLocalDpi xmlns:a14="http://schemas.microsoft.com/office/drawing/2010/main" val="0"/>
+                        </a:ext>
+                      </a:extLst>
+                    </a:blip>
+                    <a:stretch>
+                      <a:fillRect/>
+                    </a:stretch>
+                  </pic:blipFill>
+                  <pic:spPr>
+                    <a:xfrm>
+                      <a:off x="0" y="0"/>
+                      <a:ext cx="5305425" cy="3942080"/>
+                    </a:xfrm>
+                    <a:prstGeom prst="rect">
+                      <a:avLst/>
+                    </a:prstGeom>
+                  </pic:spPr>
+                </pic:pic>
+              </a:graphicData>
+            </a:graphic>
+            <wp14:sizeRelH relativeFrom="margin">
+              <wp14:pctWidth>0</wp14:pctWidth>
+            </wp14:sizeRelH>
+            <wp14:sizeRelV relativeFrom="margin">
+              <wp14:pctHeight>0</wp14:pctHeight>
+            </wp14:sizeRelV>
+          </wp:anchor>
+        </w:drawing>
+      </w:r>
+      <w:r>
+        <w:rPr>
+          <w:sz w:val="52"/>
+          <w:szCs w:val="52"/>
+        </w:rPr>
+        <w:tab/>
+      </w:r>
+    </w:p>
+    <w:p>
+      <w:pPr>
+        <w:tabs>
+          <w:tab w:val="left" w:pos="7181"/>
+        </w:tabs>
+        <w:rPr>
+          <w:sz w:val="52"/>
+          <w:szCs w:val="52"/>
+        </w:rPr>
+      </w:pPr>
+    </w:p>
+    <w:p>
+      <w:pPr>
+        <w:tabs>
+          <w:tab w:val="left" w:pos="7181"/>
+        </w:tabs>
+        <w:rPr>
+          <w:sz w:val="52"/>
+          <w:szCs w:val="52"/>
+        </w:rPr>
+      </w:pPr>
+    </w:p>
+    <w:p>
+      <w:pPr>
+        <w:tabs>
+          <w:tab w:val="left" w:pos="7181"/>
+        </w:tabs>
+        <w:rPr>
+          <w:sz w:val="52"/>
+          <w:szCs w:val="52"/>
+        </w:rPr>
+      </w:pPr>
+    </w:p>
+    <w:p>
+      <w:pPr>
+        <w:tabs>
+          <w:tab w:val="left" w:pos="7181"/>
+        </w:tabs>
+        <w:rPr>
+          <w:sz w:val="52"/>
+          <w:szCs w:val="52"/>
+        </w:rPr>
+      </w:pPr>
+    </w:p>
+    <w:p>
+      <w:pPr>
+        <w:tabs>
+          <w:tab w:val="left" w:pos="7181"/>
+        </w:tabs>
+        <w:rPr>
+          <w:sz w:val="52"/>
+          <w:szCs w:val="52"/>
+        </w:rPr>
+      </w:pPr>
+      <w:r>
+        <w:rPr>
+          <w:sz w:val="52"/>
+          <w:szCs w:val="52"/>
+        </w:rPr>
+        <w:lastRenderedPageBreak/>
+        <w:drawing>
+          <wp:anchor distT="0" distB="0" distL="114300" distR="114300" simplePos="0" relativeHeight="251668480" behindDoc="1" locked="0" layoutInCell="1" allowOverlap="1" wp14:anchorId="06D59484" wp14:editId="74545CF5">
+            <wp:simplePos x="0" y="0"/>
+            <wp:positionH relativeFrom="column">
+              <wp:posOffset>-259080</wp:posOffset>
+            </wp:positionH>
+            <wp:positionV relativeFrom="paragraph">
+              <wp:posOffset>4445</wp:posOffset>
+            </wp:positionV>
+            <wp:extent cx="5581015" cy="3767455"/>
+            <wp:effectExtent l="0" t="0" r="635" b="4445"/>
+            <wp:wrapTight wrapText="bothSides">
+              <wp:wrapPolygon edited="0">
+                <wp:start x="0" y="0"/>
+                <wp:lineTo x="0" y="21516"/>
+                <wp:lineTo x="21529" y="21516"/>
+                <wp:lineTo x="21529" y="0"/>
+                <wp:lineTo x="0" y="0"/>
+              </wp:wrapPolygon>
+            </wp:wrapTight>
+            <wp:docPr id="160317593" name="Image 1"/>
+            <wp:cNvGraphicFramePr>
+              <a:graphicFrameLocks xmlns:a="http://schemas.openxmlformats.org/drawingml/2006/main" noChangeAspect="1"/>
+            </wp:cNvGraphicFramePr>
+            <a:graphic xmlns:a="http://schemas.openxmlformats.org/drawingml/2006/main">
+              <a:graphicData uri="http://schemas.openxmlformats.org/drawingml/2006/picture">
+                <pic:pic xmlns:pic="http://schemas.openxmlformats.org/drawingml/2006/picture">
+                  <pic:nvPicPr>
+                    <pic:cNvPr id="160317593" name=""/>
+                    <pic:cNvPicPr/>
+                  </pic:nvPicPr>
+                  <pic:blipFill>
+                    <a:blip r:embed="rId26">
+                      <a:extLst>
+                        <a:ext uri="{28A0092B-C50C-407E-A947-70E740481C1C}">
+                          <a14:useLocalDpi xmlns:a14="http://schemas.microsoft.com/office/drawing/2010/main" val="0"/>
+                        </a:ext>
+                      </a:extLst>
+                    </a:blip>
+                    <a:stretch>
+                      <a:fillRect/>
+                    </a:stretch>
+                  </pic:blipFill>
+                  <pic:spPr>
+                    <a:xfrm>
+                      <a:off x="0" y="0"/>
+                      <a:ext cx="5581015" cy="3767455"/>
+                    </a:xfrm>
+                    <a:prstGeom prst="rect">
+                      <a:avLst/>
+                    </a:prstGeom>
+                  </pic:spPr>
+                </pic:pic>
+              </a:graphicData>
+            </a:graphic>
+            <wp14:sizeRelH relativeFrom="margin">
+              <wp14:pctWidth>0</wp14:pctWidth>
+            </wp14:sizeRelH>
+            <wp14:sizeRelV relativeFrom="margin">
+              <wp14:pctHeight>0</wp14:pctHeight>
+            </wp14:sizeRelV>
+          </wp:anchor>
+        </w:drawing>
+      </w:r>
+    </w:p>
+    <w:p>
+      <w:pPr>
+        <w:tabs>
+          <w:tab w:val="left" w:pos="7181"/>
+        </w:tabs>
+        <w:rPr>
+          <w:sz w:val="52"/>
+          <w:szCs w:val="52"/>
+        </w:rPr>
+      </w:pPr>
+    </w:p>
+    <w:p>
+      <w:pPr>
+        <w:tabs>
+          <w:tab w:val="left" w:pos="7181"/>
+        </w:tabs>
+        <w:rPr>
+          <w:sz w:val="52"/>
+          <w:szCs w:val="52"/>
+        </w:rPr>
+      </w:pPr>
+    </w:p>
+    <w:p>
+      <w:pPr>
+        <w:tabs>
+          <w:tab w:val="left" w:pos="7181"/>
+        </w:tabs>
+        <w:rPr>
+          <w:sz w:val="52"/>
+          <w:szCs w:val="52"/>
+        </w:rPr>
+      </w:pPr>
+    </w:p>
+    <w:p>
+      <w:pPr>
+        <w:tabs>
+          <w:tab w:val="left" w:pos="7181"/>
+        </w:tabs>
+        <w:rPr>
+          <w:sz w:val="52"/>
+          <w:szCs w:val="52"/>
+        </w:rPr>
+      </w:pPr>
+    </w:p>
+    <w:p>
+      <w:pPr>
+        <w:tabs>
+          <w:tab w:val="left" w:pos="7181"/>
+        </w:tabs>
+        <w:rPr>
+          <w:sz w:val="52"/>
+          <w:szCs w:val="52"/>
+        </w:rPr>
+      </w:pPr>
+    </w:p>
+    <w:p>
+      <w:pPr>
+        <w:tabs>
+          <w:tab w:val="left" w:pos="7181"/>
+        </w:tabs>
+        <w:rPr>
+          <w:sz w:val="52"/>
+          <w:szCs w:val="52"/>
+        </w:rPr>
+      </w:pPr>
+    </w:p>
+    <w:p>
+      <w:pPr>
+        <w:tabs>
+          <w:tab w:val="left" w:pos="7181"/>
+        </w:tabs>
+        <w:rPr>
+          <w:sz w:val="52"/>
+          <w:szCs w:val="52"/>
+        </w:rPr>
+      </w:pPr>
+      <w:r>
+        <w:rPr>
+          <w:sz w:val="52"/>
+          <w:szCs w:val="52"/>
+        </w:rPr>
+        <w:drawing>
+          <wp:inline distT="0" distB="0" distL="0" distR="0" wp14:anchorId="013EA48B" wp14:editId="1F650C4C">
+            <wp:extent cx="5760720" cy="4276090"/>
+            <wp:effectExtent l="0" t="0" r="0" b="0"/>
+            <wp:docPr id="355022426" name="Image 1"/>
+            <wp:cNvGraphicFramePr>
+              <a:graphicFrameLocks xmlns:a="http://schemas.openxmlformats.org/drawingml/2006/main" noChangeAspect="1"/>
+            </wp:cNvGraphicFramePr>
+            <a:graphic xmlns:a="http://schemas.openxmlformats.org/drawingml/2006/main">
+              <a:graphicData uri="http://schemas.openxmlformats.org/drawingml/2006/picture">
+                <pic:pic xmlns:pic="http://schemas.openxmlformats.org/drawingml/2006/picture">
+                  <pic:nvPicPr>
+                    <pic:cNvPr id="355022426" name=""/>
+                    <pic:cNvPicPr/>
+                  </pic:nvPicPr>
+                  <pic:blipFill>
+                    <a:blip r:embed="rId27"/>
+                    <a:stretch>
+                      <a:fillRect/>
+                    </a:stretch>
+                  </pic:blipFill>
+                  <pic:spPr>
+                    <a:xfrm>
+                      <a:off x="0" y="0"/>
+                      <a:ext cx="5760720" cy="4276090"/>
+                    </a:xfrm>
+                    <a:prstGeom prst="rect">
+                      <a:avLst/>
+                    </a:prstGeom>
+                  </pic:spPr>
+                </pic:pic>
+              </a:graphicData>
+            </a:graphic>
+          </wp:inline>
+        </w:drawing>
+      </w:r>
+    </w:p>
+    <w:p>
+      <w:pPr>
+        <w:tabs>
+          <w:tab w:val="left" w:pos="7181"/>
+        </w:tabs>
+        <w:rPr>
+          <w:sz w:val="52"/>
+          <w:szCs w:val="52"/>
+        </w:rPr>
+      </w:pPr>
+      <w:r>
+        <w:rPr>
+          <w:sz w:val="52"/>
+          <w:szCs w:val="52"/>
+        </w:rPr>
+        <w:lastRenderedPageBreak/>
+        <w:drawing>
+          <wp:anchor distT="0" distB="0" distL="114300" distR="114300" simplePos="0" relativeHeight="251669504" behindDoc="1" locked="0" layoutInCell="1" allowOverlap="1" wp14:anchorId="2786ACDC" wp14:editId="27AECF4A">
+            <wp:simplePos x="0" y="0"/>
+            <wp:positionH relativeFrom="margin">
+              <wp:align>left</wp:align>
+            </wp:positionH>
+            <wp:positionV relativeFrom="paragraph">
+              <wp:posOffset>4445</wp:posOffset>
+            </wp:positionV>
+            <wp:extent cx="6066155" cy="3883025"/>
+            <wp:effectExtent l="0" t="0" r="0" b="3175"/>
+            <wp:wrapTight wrapText="bothSides">
+              <wp:wrapPolygon edited="0">
+                <wp:start x="0" y="0"/>
+                <wp:lineTo x="0" y="21512"/>
+                <wp:lineTo x="21503" y="21512"/>
+                <wp:lineTo x="21503" y="0"/>
+                <wp:lineTo x="0" y="0"/>
+              </wp:wrapPolygon>
+            </wp:wrapTight>
+            <wp:docPr id="721023611" name="Image 1"/>
+            <wp:cNvGraphicFramePr>
+              <a:graphicFrameLocks xmlns:a="http://schemas.openxmlformats.org/drawingml/2006/main" noChangeAspect="1"/>
+            </wp:cNvGraphicFramePr>
+            <a:graphic xmlns:a="http://schemas.openxmlformats.org/drawingml/2006/main">
+              <a:graphicData uri="http://schemas.openxmlformats.org/drawingml/2006/picture">
+                <pic:pic xmlns:pic="http://schemas.openxmlformats.org/drawingml/2006/picture">
+                  <pic:nvPicPr>
+                    <pic:cNvPr id="721023611" name=""/>
+                    <pic:cNvPicPr/>
+                  </pic:nvPicPr>
+                  <pic:blipFill>
+                    <a:blip r:embed="rId28">
+                      <a:extLst>
+                        <a:ext uri="{28A0092B-C50C-407E-A947-70E740481C1C}">
+                          <a14:useLocalDpi xmlns:a14="http://schemas.microsoft.com/office/drawing/2010/main" val="0"/>
+                        </a:ext>
+                      </a:extLst>
+                    </a:blip>
+                    <a:stretch>
+                      <a:fillRect/>
+                    </a:stretch>
+                  </pic:blipFill>
+                  <pic:spPr>
+                    <a:xfrm>
+                      <a:off x="0" y="0"/>
+                      <a:ext cx="6066155" cy="3883025"/>
+                    </a:xfrm>
+                    <a:prstGeom prst="rect">
+                      <a:avLst/>
+                    </a:prstGeom>
+                  </pic:spPr>
+                </pic:pic>
+              </a:graphicData>
+            </a:graphic>
+            <wp14:sizeRelH relativeFrom="margin">
+              <wp14:pctWidth>0</wp14:pctWidth>
+            </wp14:sizeRelH>
+            <wp14:sizeRelV relativeFrom="margin">
+              <wp14:pctHeight>0</wp14:pctHeight>
+            </wp14:sizeRelV>
+          </wp:anchor>
+        </w:drawing>
+      </w:r>
+    </w:p>
+    <w:p>
+      <w:pPr>
+        <w:tabs>
+          <w:tab w:val="left" w:pos="7181"/>
+        </w:tabs>
+        <w:rPr>
+          <w:sz w:val="52"/>
+          <w:szCs w:val="52"/>
+        </w:rPr>
+      </w:pPr>
+    </w:p>
+    <w:p>
+      <w:pPr>
+        <w:tabs>
+          <w:tab w:val="left" w:pos="7181"/>
+        </w:tabs>
+        <w:rPr>
+          <w:sz w:val="52"/>
+          <w:szCs w:val="52"/>
+        </w:rPr>
+      </w:pPr>
     </w:p>
     <w:sectPr>
-      <w:headerReference r:id="rId5" w:type="default"/>
+      <w:headerReference w:type="default" r:id="rId29"/>
       <w:pgSz w:w="11906" w:h="16838"/>
       <w:pgMar w:top="1417" w:right="1417" w:bottom="1417" w:left="1417" w:header="708" w:footer="708" w:gutter="0"/>
-      <w:cols w:space="708" w:num="1"/>
-      <w:docGrid w:linePitch="360" w:charSpace="0"/>
+      <w:cols w:space="708"/>
+      <w:docGrid w:linePitch="360"/>
     </w:sectPr>
   </w:body>
 </w:document>
 </file>
 
 <file path=word/endnotes.xml><?xml version="1.0" encoding="utf-8"?>
-<w:endnotes xmlns:wpc="http://schemas.microsoft.com/office/word/2010/wordprocessingCanvas" xmlns:mc="http://schemas.openxmlformats.org/markup-compatibility/2006" xmlns:o="urn:schemas-microsoft-com:office:office" xmlns:r="http://schemas.openxmlformats.org/officeDocument/2006/relationships" xmlns:m="http://schemas.openxmlformats.org/officeDocument/2006/math" xmlns:v="urn:schemas-microsoft-com:vml" xmlns:wp14="http://schemas.microsoft.com/office/word/2010/wordprocessingDrawing" xmlns:wp="http://schemas.openxmlformats.org/drawingml/2006/wordprocessingDrawing" xmlns:w="http://schemas.openxmlformats.org/wordprocessingml/2006/main" xmlns:w14="http://schemas.microsoft.com/office/word/2010/wordml" xmlns:w15="http://schemas.microsoft.com/office/word/2012/wordml" xmlns:w10="urn:schemas-microsoft-com:office:word" xmlns:wpg="http://schemas.microsoft.com/office/word/2010/wordprocessingGroup" xmlns:wpi="http://schemas.microsoft.com/office/word/2010/wordprocessingInk" xmlns:wne="http://schemas.microsoft.com/office/word/2006/wordml" xmlns:wps="http://schemas.microsoft.com/office/word/2010/wordprocessingShape" xmlns:wpsCustomData="http://www.wps.cn/officeDocument/2013/wpsCustomData" mc:Ignorable="w14 w15 wp14">
-  <w:endnote w:type="separator" w:id="0">
+<w:endnotes xmlns:wpc="http://schemas.microsoft.com/office/word/2010/wordprocessingCanvas" xmlns:cx="http://schemas.microsoft.com/office/drawing/2014/chartex" xmlns:cx1="http://schemas.microsoft.com/office/drawing/2015/9/8/chartex" xmlns:cx2="http://schemas.microsoft.com/office/drawing/2015/10/21/chartex" xmlns:cx3="http://schemas.microsoft.com/office/drawing/2016/5/9/chartex" xmlns:cx4="http://schemas.microsoft.com/office/drawing/2016/5/10/chartex" xmlns:cx5="http://schemas.microsoft.com/office/drawing/2016/5/11/chartex" xmlns:cx6="http://schemas.microsoft.com/office/drawing/2016/5/12/chartex" xmlns:cx7="http://schemas.microsoft.com/office/drawing/2016/5/13/chartex" xmlns:cx8="http://schemas.microsoft.com/office/drawing/2016/5/14/chartex" xmlns:mc="http://schemas.openxmlformats.org/markup-compatibility/2006" xmlns:aink="http://schemas.microsoft.com/office/drawing/2016/ink" xmlns:am3d="http://schemas.microsoft.com/office/drawing/2017/model3d" xmlns:o="urn:schemas-microsoft-com:office:office" xmlns:oel="http://schemas.microsoft.com/office/2019/extlst" xmlns:r="http://schemas.openxmlformats.org/officeDocument/2006/relationships" xmlns:m="http://schemas.openxmlformats.org/officeDocument/2006/math" xmlns:v="urn:schemas-microsoft-com:vml" xmlns:wp14="http://schemas.microsoft.com/office/word/2010/wordprocessingDrawing" xmlns:wp="http://schemas.openxmlformats.org/drawingml/2006/wordprocessingDrawing" xmlns:w10="urn:schemas-microsoft-com:office:word" xmlns:w="http://schemas.openxmlformats.org/wordprocessingml/2006/main" xmlns:w14="http://schemas.microsoft.com/office/word/2010/wordml" xmlns:w15="http://schemas.microsoft.com/office/word/2012/wordml" xmlns:w16cex="http://schemas.microsoft.com/office/word/2018/wordml/cex" xmlns:w16cid="http://schemas.microsoft.com/office/word/2016/wordml/cid" xmlns:w16="http://schemas.microsoft.com/office/word/2018/wordml" xmlns:w16du="http://schemas.microsoft.com/office/word/2023/wordml/word16du" xmlns:w16sdtdh="http://schemas.microsoft.com/office/word/2020/wordml/sdtdatahash" xmlns:w16sdtfl="http://schemas.microsoft.com/office/word/2024/wordml/sdtformatlock" xmlns:w16se="http://schemas.microsoft.com/office/word/2015/wordml/symex" xmlns:wpg="http://schemas.microsoft.com/office/word/2010/wordprocessingGroup" xmlns:wpi="http://schemas.microsoft.com/office/word/2010/wordprocessingInk" xmlns:wne="http://schemas.microsoft.com/office/word/2006/wordml" xmlns:wps="http://schemas.microsoft.com/office/word/2010/wordprocessingShape" mc:Ignorable="w14 w15 w16se w16cid w16 w16cex w16sdtdh w16sdtfl w16du wp14">
+  <w:endnote w:type="separator" w:id="-1">
     <w:p>
       <w:pPr>
         <w:spacing w:line="240" w:lineRule="auto"/>
@@ -1267,7 +2085,7 @@
       </w:r>
     </w:p>
   </w:endnote>
-  <w:endnote w:type="continuationSeparator" w:id="1">
+  <w:endnote w:type="continuationSeparator" w:id="0">
     <w:p>
       <w:pPr>
         <w:spacing w:line="240" w:lineRule="auto"/>
@@ -1281,21 +2099,21 @@
 </file>
 
 <file path=word/footnotes.xml><?xml version="1.0" encoding="utf-8"?>
-<w:footnotes xmlns:wpc="http://schemas.microsoft.com/office/word/2010/wordprocessingCanvas" xmlns:mc="http://schemas.openxmlformats.org/markup-compatibility/2006" xmlns:o="urn:schemas-microsoft-com:office:office" xmlns:r="http://schemas.openxmlformats.org/officeDocument/2006/relationships" xmlns:m="http://schemas.openxmlformats.org/officeDocument/2006/math" xmlns:v="urn:schemas-microsoft-com:vml" xmlns:wp14="http://schemas.microsoft.com/office/word/2010/wordprocessingDrawing" xmlns:wp="http://schemas.openxmlformats.org/drawingml/2006/wordprocessingDrawing" xmlns:w="http://schemas.openxmlformats.org/wordprocessingml/2006/main" xmlns:w14="http://schemas.microsoft.com/office/word/2010/wordml" xmlns:w15="http://schemas.microsoft.com/office/word/2012/wordml" xmlns:w10="urn:schemas-microsoft-com:office:word" xmlns:wpg="http://schemas.microsoft.com/office/word/2010/wordprocessingGroup" xmlns:wpi="http://schemas.microsoft.com/office/word/2010/wordprocessingInk" xmlns:wne="http://schemas.microsoft.com/office/word/2006/wordml" xmlns:wps="http://schemas.microsoft.com/office/word/2010/wordprocessingShape" xmlns:wpsCustomData="http://www.wps.cn/officeDocument/2013/wpsCustomData" mc:Ignorable="w14 w15 wp14">
-  <w:footnote w:type="separator" w:id="0">
-    <w:p>
-      <w:pPr>
-        <w:spacing w:before="0" w:after="0" w:line="278" w:lineRule="auto"/>
+<w:footnotes xmlns:wpc="http://schemas.microsoft.com/office/word/2010/wordprocessingCanvas" xmlns:cx="http://schemas.microsoft.com/office/drawing/2014/chartex" xmlns:cx1="http://schemas.microsoft.com/office/drawing/2015/9/8/chartex" xmlns:cx2="http://schemas.microsoft.com/office/drawing/2015/10/21/chartex" xmlns:cx3="http://schemas.microsoft.com/office/drawing/2016/5/9/chartex" xmlns:cx4="http://schemas.microsoft.com/office/drawing/2016/5/10/chartex" xmlns:cx5="http://schemas.microsoft.com/office/drawing/2016/5/11/chartex" xmlns:cx6="http://schemas.microsoft.com/office/drawing/2016/5/12/chartex" xmlns:cx7="http://schemas.microsoft.com/office/drawing/2016/5/13/chartex" xmlns:cx8="http://schemas.microsoft.com/office/drawing/2016/5/14/chartex" xmlns:mc="http://schemas.openxmlformats.org/markup-compatibility/2006" xmlns:aink="http://schemas.microsoft.com/office/drawing/2016/ink" xmlns:am3d="http://schemas.microsoft.com/office/drawing/2017/model3d" xmlns:o="urn:schemas-microsoft-com:office:office" xmlns:oel="http://schemas.microsoft.com/office/2019/extlst" xmlns:r="http://schemas.openxmlformats.org/officeDocument/2006/relationships" xmlns:m="http://schemas.openxmlformats.org/officeDocument/2006/math" xmlns:v="urn:schemas-microsoft-com:vml" xmlns:wp14="http://schemas.microsoft.com/office/word/2010/wordprocessingDrawing" xmlns:wp="http://schemas.openxmlformats.org/drawingml/2006/wordprocessingDrawing" xmlns:w10="urn:schemas-microsoft-com:office:word" xmlns:w="http://schemas.openxmlformats.org/wordprocessingml/2006/main" xmlns:w14="http://schemas.microsoft.com/office/word/2010/wordml" xmlns:w15="http://schemas.microsoft.com/office/word/2012/wordml" xmlns:w16cex="http://schemas.microsoft.com/office/word/2018/wordml/cex" xmlns:w16cid="http://schemas.microsoft.com/office/word/2016/wordml/cid" xmlns:w16="http://schemas.microsoft.com/office/word/2018/wordml" xmlns:w16du="http://schemas.microsoft.com/office/word/2023/wordml/word16du" xmlns:w16sdtdh="http://schemas.microsoft.com/office/word/2020/wordml/sdtdatahash" xmlns:w16sdtfl="http://schemas.microsoft.com/office/word/2024/wordml/sdtformatlock" xmlns:w16se="http://schemas.microsoft.com/office/word/2015/wordml/symex" xmlns:wpg="http://schemas.microsoft.com/office/word/2010/wordprocessingGroup" xmlns:wpi="http://schemas.microsoft.com/office/word/2010/wordprocessingInk" xmlns:wne="http://schemas.microsoft.com/office/word/2006/wordml" xmlns:wps="http://schemas.microsoft.com/office/word/2010/wordprocessingShape" mc:Ignorable="w14 w15 w16se w16cid w16 w16cex w16sdtdh w16sdtfl w16du wp14">
+  <w:footnote w:type="separator" w:id="-1">
+    <w:p>
+      <w:pPr>
+        <w:spacing w:after="0"/>
       </w:pPr>
       <w:r>
         <w:separator/>
       </w:r>
     </w:p>
   </w:footnote>
-  <w:footnote w:type="continuationSeparator" w:id="1">
-    <w:p>
-      <w:pPr>
-        <w:spacing w:before="0" w:after="0" w:line="278" w:lineRule="auto"/>
+  <w:footnote w:type="continuationSeparator" w:id="0">
+    <w:p>
+      <w:pPr>
+        <w:spacing w:after="0"/>
       </w:pPr>
       <w:r>
         <w:continuationSeparator/>
@@ -1306,15 +2124,18 @@
 </file>
 
 <file path=word/header1.xml><?xml version="1.0" encoding="utf-8"?>
-<w:hdr xmlns:wpc="http://schemas.microsoft.com/office/word/2010/wordprocessingCanvas" xmlns:mc="http://schemas.openxmlformats.org/markup-compatibility/2006" xmlns:o="urn:schemas-microsoft-com:office:office" xmlns:r="http://schemas.openxmlformats.org/officeDocument/2006/relationships" xmlns:m="http://schemas.openxmlformats.org/officeDocument/2006/math" xmlns:v="urn:schemas-microsoft-com:vml" xmlns:wp14="http://schemas.microsoft.com/office/word/2010/wordprocessingDrawing" xmlns:wp="http://schemas.openxmlformats.org/drawingml/2006/wordprocessingDrawing" xmlns:w10="urn:schemas-microsoft-com:office:word" xmlns:w="http://schemas.openxmlformats.org/wordprocessingml/2006/main" xmlns:w14="http://schemas.microsoft.com/office/word/2010/wordml" xmlns:w15="http://schemas.microsoft.com/office/word/2012/wordml" xmlns:wpg="http://schemas.microsoft.com/office/word/2010/wordprocessingGroup" xmlns:wpi="http://schemas.microsoft.com/office/word/2010/wordprocessingInk" xmlns:wne="http://schemas.microsoft.com/office/word/2006/wordml" xmlns:wps="http://schemas.microsoft.com/office/word/2010/wordprocessingShape" xmlns:wpsCustomData="http://www.wps.cn/officeDocument/2013/wpsCustomData" mc:Ignorable="w14 w15 wp14">
+<w:hdr xmlns:wpc="http://schemas.microsoft.com/office/word/2010/wordprocessingCanvas" xmlns:cx="http://schemas.microsoft.com/office/drawing/2014/chartex" xmlns:cx1="http://schemas.microsoft.com/office/drawing/2015/9/8/chartex" xmlns:cx2="http://schemas.microsoft.com/office/drawing/2015/10/21/chartex" xmlns:cx3="http://schemas.microsoft.com/office/drawing/2016/5/9/chartex" xmlns:cx4="http://schemas.microsoft.com/office/drawing/2016/5/10/chartex" xmlns:cx5="http://schemas.microsoft.com/office/drawing/2016/5/11/chartex" xmlns:cx6="http://schemas.microsoft.com/office/drawing/2016/5/12/chartex" xmlns:cx7="http://schemas.microsoft.com/office/drawing/2016/5/13/chartex" xmlns:cx8="http://schemas.microsoft.com/office/drawing/2016/5/14/chartex" xmlns:mc="http://schemas.openxmlformats.org/markup-compatibility/2006" xmlns:aink="http://schemas.microsoft.com/office/drawing/2016/ink" xmlns:am3d="http://schemas.microsoft.com/office/drawing/2017/model3d" xmlns:o="urn:schemas-microsoft-com:office:office" xmlns:oel="http://schemas.microsoft.com/office/2019/extlst" xmlns:r="http://schemas.openxmlformats.org/officeDocument/2006/relationships" xmlns:m="http://schemas.openxmlformats.org/officeDocument/2006/math" xmlns:v="urn:schemas-microsoft-com:vml" xmlns:wp14="http://schemas.microsoft.com/office/word/2010/wordprocessingDrawing" xmlns:wp="http://schemas.openxmlformats.org/drawingml/2006/wordprocessingDrawing" xmlns:w10="urn:schemas-microsoft-com:office:word" xmlns:w="http://schemas.openxmlformats.org/wordprocessingml/2006/main" xmlns:w14="http://schemas.microsoft.com/office/word/2010/wordml" xmlns:w15="http://schemas.microsoft.com/office/word/2012/wordml" xmlns:w16cex="http://schemas.microsoft.com/office/word/2018/wordml/cex" xmlns:w16cid="http://schemas.microsoft.com/office/word/2016/wordml/cid" xmlns:w16="http://schemas.microsoft.com/office/word/2018/wordml" xmlns:w16du="http://schemas.microsoft.com/office/word/2023/wordml/word16du" xmlns:w16sdtdh="http://schemas.microsoft.com/office/word/2020/wordml/sdtdatahash" xmlns:w16sdtfl="http://schemas.microsoft.com/office/word/2024/wordml/sdtformatlock" xmlns:w16se="http://schemas.microsoft.com/office/word/2015/wordml/symex" xmlns:wpg="http://schemas.microsoft.com/office/word/2010/wordprocessingGroup" xmlns:wpi="http://schemas.microsoft.com/office/word/2010/wordprocessingInk" xmlns:wne="http://schemas.microsoft.com/office/word/2006/wordml" xmlns:wps="http://schemas.microsoft.com/office/word/2010/wordprocessingShape" mc:Ignorable="w14 w15 w16se w16cid w16 w16cex w16sdtdh w16sdtfl w16du wp14">
   <w:p>
     <w:pPr>
-      <w:pStyle w:val="16"/>
+      <w:pStyle w:val="En-tte"/>
       <w:ind w:left="-964"/>
     </w:pPr>
     <w:r>
+      <w:rPr>
+        <w:noProof/>
+      </w:rPr>
       <w:drawing>
-        <wp:inline distT="0" distB="0" distL="0" distR="0">
+        <wp:inline distT="0" distB="0" distL="0" distR="0" wp14:anchorId="75DB507B" wp14:editId="79AB7884">
           <wp:extent cx="7360285" cy="678180"/>
           <wp:effectExtent l="0" t="0" r="0" b="7620"/>
           <wp:docPr id="2097053211" name="Image 1"/>
@@ -1356,149 +2177,415 @@
 </file>
 
 <file path=word/styles.xml><?xml version="1.0" encoding="utf-8"?>
-<w:styles xmlns:mc="http://schemas.openxmlformats.org/markup-compatibility/2006" xmlns:o="urn:schemas-microsoft-com:office:office" xmlns:r="http://schemas.openxmlformats.org/officeDocument/2006/relationships" xmlns:m="http://schemas.openxmlformats.org/officeDocument/2006/math" xmlns:v="urn:schemas-microsoft-com:vml" xmlns:w="http://schemas.openxmlformats.org/wordprocessingml/2006/main" xmlns:w14="http://schemas.microsoft.com/office/word/2010/wordml" xmlns:w10="urn:schemas-microsoft-com:office:word" xmlns:sl="http://schemas.openxmlformats.org/schemaLibrary/2006/main" xmlns:wpsCustomData="http://www.wps.cn/officeDocument/2013/wpsCustomData" mc:Ignorable="w14">
+<w:styles xmlns:mc="http://schemas.openxmlformats.org/markup-compatibility/2006" xmlns:r="http://schemas.openxmlformats.org/officeDocument/2006/relationships" xmlns:w="http://schemas.openxmlformats.org/wordprocessingml/2006/main" xmlns:w14="http://schemas.microsoft.com/office/word/2010/wordml" xmlns:w15="http://schemas.microsoft.com/office/word/2012/wordml" xmlns:w16cex="http://schemas.microsoft.com/office/word/2018/wordml/cex" xmlns:w16cid="http://schemas.microsoft.com/office/word/2016/wordml/cid" xmlns:w16="http://schemas.microsoft.com/office/word/2018/wordml" xmlns:w16du="http://schemas.microsoft.com/office/word/2023/wordml/word16du" xmlns:w16sdtdh="http://schemas.microsoft.com/office/word/2020/wordml/sdtdatahash" xmlns:w16sdtfl="http://schemas.microsoft.com/office/word/2024/wordml/sdtformatlock" xmlns:w16se="http://schemas.microsoft.com/office/word/2015/wordml/symex" mc:Ignorable="w14 w15 w16se w16cid w16 w16cex w16sdtdh w16sdtfl w16du">
   <w:docDefaults>
     <w:rPrDefault>
       <w:rPr>
-        <w:rFonts w:ascii="Times New Roman" w:hAnsi="Times New Roman" w:eastAsia="SimSun" w:cs="Times New Roman"/>
+        <w:rFonts w:ascii="Times New Roman" w:eastAsia="SimSun" w:hAnsi="Times New Roman" w:cs="Times New Roman"/>
+        <w:lang w:val="fr-FR" w:eastAsia="fr-FR" w:bidi="ar-SA"/>
       </w:rPr>
     </w:rPrDefault>
     <w:pPrDefault/>
   </w:docDefaults>
-  <w:latentStyles w:count="260" w:defQFormat="0" w:defUnhideWhenUsed="1" w:defSemiHidden="1" w:defUIPriority="99" w:defLockedState="0">
-    <w:lsdException w:qFormat="1" w:unhideWhenUsed="0" w:uiPriority="0" w:semiHidden="0" w:name="Normal"/>
-    <w:lsdException w:qFormat="1" w:unhideWhenUsed="0" w:uiPriority="9" w:semiHidden="0" w:name="heading 1"/>
-    <w:lsdException w:qFormat="1" w:uiPriority="9" w:name="heading 2"/>
-    <w:lsdException w:qFormat="1" w:uiPriority="9" w:name="heading 3"/>
-    <w:lsdException w:qFormat="1" w:uiPriority="9" w:name="heading 4"/>
-    <w:lsdException w:qFormat="1" w:uiPriority="9" w:name="heading 5"/>
-    <w:lsdException w:qFormat="1" w:uiPriority="9" w:name="heading 6"/>
-    <w:lsdException w:qFormat="1" w:uiPriority="9" w:name="heading 7"/>
-    <w:lsdException w:qFormat="1" w:uiPriority="9" w:name="heading 8"/>
-    <w:lsdException w:qFormat="1" w:uiPriority="9" w:name="heading 9"/>
-    <w:lsdException w:uiPriority="99" w:name="index 1"/>
-    <w:lsdException w:uiPriority="99" w:name="index 2"/>
-    <w:lsdException w:uiPriority="99" w:name="index 3"/>
-    <w:lsdException w:uiPriority="99" w:name="index 4"/>
-    <w:lsdException w:uiPriority="99" w:name="index 5"/>
-    <w:lsdException w:uiPriority="99" w:name="index 6"/>
-    <w:lsdException w:uiPriority="99" w:name="index 7"/>
-    <w:lsdException w:uiPriority="99" w:name="index 8"/>
-    <w:lsdException w:uiPriority="99" w:name="index 9"/>
-    <w:lsdException w:uiPriority="39" w:name="toc 1"/>
-    <w:lsdException w:uiPriority="39" w:name="toc 2"/>
-    <w:lsdException w:uiPriority="39" w:name="toc 3"/>
-    <w:lsdException w:uiPriority="39" w:name="toc 4"/>
-    <w:lsdException w:uiPriority="39" w:name="toc 5"/>
-    <w:lsdException w:uiPriority="39" w:name="toc 6"/>
-    <w:lsdException w:uiPriority="39" w:name="toc 7"/>
-    <w:lsdException w:uiPriority="39" w:name="toc 8"/>
-    <w:lsdException w:uiPriority="39" w:name="toc 9"/>
-    <w:lsdException w:uiPriority="99" w:name="Normal Indent"/>
-    <w:lsdException w:uiPriority="99" w:name="footnote text"/>
-    <w:lsdException w:uiPriority="99" w:name="annotation text"/>
-    <w:lsdException w:uiPriority="99" w:semiHidden="0" w:name="header"/>
-    <w:lsdException w:uiPriority="99" w:semiHidden="0" w:name="footer"/>
-    <w:lsdException w:uiPriority="99" w:name="index heading"/>
-    <w:lsdException w:qFormat="1" w:uiPriority="35" w:name="caption"/>
-    <w:lsdException w:uiPriority="99" w:name="table of figures"/>
-    <w:lsdException w:uiPriority="99" w:name="envelope address"/>
-    <w:lsdException w:uiPriority="99" w:name="envelope return"/>
-    <w:lsdException w:uiPriority="99" w:name="footnote reference"/>
-    <w:lsdException w:uiPriority="99" w:name="annotation reference"/>
-    <w:lsdException w:uiPriority="99" w:name="line number"/>
-    <w:lsdException w:uiPriority="99" w:name="page number"/>
-    <w:lsdException w:uiPriority="99" w:name="endnote reference"/>
-    <w:lsdException w:uiPriority="99" w:name="endnote text"/>
-    <w:lsdException w:uiPriority="99" w:name="table of authorities"/>
-    <w:lsdException w:uiPriority="99" w:name="macro"/>
-    <w:lsdException w:uiPriority="99" w:name="toa heading"/>
-    <w:lsdException w:uiPriority="99" w:name="List"/>
-    <w:lsdException w:uiPriority="99" w:name="List Bullet"/>
-    <w:lsdException w:uiPriority="99" w:name="List Number"/>
-    <w:lsdException w:uiPriority="99" w:name="List 2"/>
-    <w:lsdException w:uiPriority="99" w:name="List 3"/>
-    <w:lsdException w:uiPriority="99" w:name="List 4"/>
-    <w:lsdException w:uiPriority="99" w:name="List 5"/>
-    <w:lsdException w:uiPriority="99" w:name="List Bullet 2"/>
-    <w:lsdException w:uiPriority="99" w:name="List Bullet 3"/>
-    <w:lsdException w:uiPriority="99" w:name="List Bullet 4"/>
-    <w:lsdException w:uiPriority="99" w:name="List Bullet 5"/>
-    <w:lsdException w:uiPriority="99" w:name="List Number 2"/>
-    <w:lsdException w:uiPriority="99" w:name="List Number 3"/>
-    <w:lsdException w:uiPriority="99" w:name="List Number 4"/>
-    <w:lsdException w:uiPriority="99" w:name="List Number 5"/>
-    <w:lsdException w:qFormat="1" w:unhideWhenUsed="0" w:uiPriority="10" w:semiHidden="0" w:name="Title"/>
-    <w:lsdException w:uiPriority="99" w:name="Closing"/>
-    <w:lsdException w:uiPriority="99" w:name="Signature"/>
-    <w:lsdException w:uiPriority="1" w:semiHidden="0" w:name="Default Paragraph Font"/>
-    <w:lsdException w:uiPriority="99" w:name="Body Text"/>
-    <w:lsdException w:uiPriority="99" w:name="Body Text Indent"/>
-    <w:lsdException w:uiPriority="99" w:name="List Continue"/>
-    <w:lsdException w:uiPriority="99" w:name="List Continue 2"/>
-    <w:lsdException w:uiPriority="99" w:name="List Continue 3"/>
-    <w:lsdException w:uiPriority="99" w:name="List Continue 4"/>
-    <w:lsdException w:uiPriority="99" w:name="List Continue 5"/>
-    <w:lsdException w:uiPriority="99" w:name="Message Header"/>
-    <w:lsdException w:qFormat="1" w:unhideWhenUsed="0" w:uiPriority="11" w:semiHidden="0" w:name="Subtitle"/>
-    <w:lsdException w:uiPriority="99" w:name="Salutation"/>
-    <w:lsdException w:uiPriority="99" w:name="Date"/>
-    <w:lsdException w:uiPriority="99" w:name="Body Text First Indent"/>
-    <w:lsdException w:uiPriority="99" w:name="Body Text First Indent 2"/>
-    <w:lsdException w:uiPriority="99" w:name="Note Heading"/>
-    <w:lsdException w:uiPriority="99" w:name="Body Text 2"/>
-    <w:lsdException w:uiPriority="99" w:name="Body Text 3"/>
-    <w:lsdException w:uiPriority="99" w:name="Body Text Indent 2"/>
-    <w:lsdException w:uiPriority="99" w:name="Body Text Indent 3"/>
-    <w:lsdException w:uiPriority="99" w:name="Block Text"/>
-    <w:lsdException w:uiPriority="99" w:name="Hyperlink"/>
-    <w:lsdException w:uiPriority="99" w:name="FollowedHyperlink"/>
-    <w:lsdException w:qFormat="1" w:unhideWhenUsed="0" w:uiPriority="22" w:semiHidden="0" w:name="Strong"/>
-    <w:lsdException w:qFormat="1" w:unhideWhenUsed="0" w:uiPriority="20" w:semiHidden="0" w:name="Emphasis"/>
-    <w:lsdException w:uiPriority="99" w:name="Document Map"/>
-    <w:lsdException w:uiPriority="99" w:name="Plain Text"/>
-    <w:lsdException w:uiPriority="99" w:name="E-mail Signature"/>
-    <w:lsdException w:uiPriority="99" w:name="Normal (Web)"/>
-    <w:lsdException w:uiPriority="99" w:name="HTML Acronym"/>
-    <w:lsdException w:uiPriority="99" w:name="HTML Address"/>
-    <w:lsdException w:uiPriority="99" w:name="HTML Cite"/>
-    <w:lsdException w:uiPriority="99" w:name="HTML Code"/>
-    <w:lsdException w:uiPriority="99" w:name="HTML Definition"/>
-    <w:lsdException w:uiPriority="99" w:name="HTML Keyboard"/>
-    <w:lsdException w:uiPriority="99" w:name="HTML Preformatted"/>
-    <w:lsdException w:uiPriority="99" w:name="HTML Sample"/>
-    <w:lsdException w:uiPriority="99" w:name="HTML Typewriter"/>
-    <w:lsdException w:uiPriority="99" w:name="HTML Variable"/>
-    <w:lsdException w:qFormat="1" w:uiPriority="99" w:name="Normal Table"/>
-    <w:lsdException w:uiPriority="99" w:name="annotation subject"/>
-    <w:lsdException w:uiPriority="99" w:name="Balloon Text"/>
-    <w:lsdException w:qFormat="1" w:unhideWhenUsed="0" w:uiPriority="34" w:semiHidden="0" w:name="List Paragraph"/>
-    <w:lsdException w:qFormat="1" w:unhideWhenUsed="0" w:uiPriority="29" w:semiHidden="0" w:name="Quote"/>
-    <w:lsdException w:qFormat="1" w:unhideWhenUsed="0" w:uiPriority="30" w:semiHidden="0" w:name="Intense Quote"/>
+  <w:latentStyles w:defLockedState="0" w:defUIPriority="99" w:defSemiHidden="0" w:defUnhideWhenUsed="0" w:defQFormat="0" w:count="376">
+    <w:lsdException w:name="Normal" w:uiPriority="0" w:qFormat="1"/>
+    <w:lsdException w:name="heading 1" w:uiPriority="9" w:qFormat="1"/>
+    <w:lsdException w:name="heading 2" w:semiHidden="1" w:uiPriority="9" w:unhideWhenUsed="1" w:qFormat="1"/>
+    <w:lsdException w:name="heading 3" w:semiHidden="1" w:uiPriority="9" w:unhideWhenUsed="1" w:qFormat="1"/>
+    <w:lsdException w:name="heading 4" w:semiHidden="1" w:uiPriority="9" w:unhideWhenUsed="1" w:qFormat="1"/>
+    <w:lsdException w:name="heading 5" w:semiHidden="1" w:uiPriority="9" w:unhideWhenUsed="1" w:qFormat="1"/>
+    <w:lsdException w:name="heading 6" w:semiHidden="1" w:uiPriority="9" w:unhideWhenUsed="1" w:qFormat="1"/>
+    <w:lsdException w:name="heading 7" w:semiHidden="1" w:uiPriority="9" w:unhideWhenUsed="1" w:qFormat="1"/>
+    <w:lsdException w:name="heading 8" w:semiHidden="1" w:uiPriority="9" w:unhideWhenUsed="1" w:qFormat="1"/>
+    <w:lsdException w:name="heading 9" w:semiHidden="1" w:uiPriority="9" w:unhideWhenUsed="1" w:qFormat="1"/>
+    <w:lsdException w:name="index 1" w:semiHidden="1" w:unhideWhenUsed="1"/>
+    <w:lsdException w:name="index 2" w:semiHidden="1" w:unhideWhenUsed="1"/>
+    <w:lsdException w:name="index 3" w:semiHidden="1" w:unhideWhenUsed="1"/>
+    <w:lsdException w:name="index 4" w:semiHidden="1" w:unhideWhenUsed="1"/>
+    <w:lsdException w:name="index 5" w:semiHidden="1" w:unhideWhenUsed="1"/>
+    <w:lsdException w:name="index 6" w:semiHidden="1" w:unhideWhenUsed="1"/>
+    <w:lsdException w:name="index 7" w:semiHidden="1" w:unhideWhenUsed="1"/>
+    <w:lsdException w:name="index 8" w:semiHidden="1" w:unhideWhenUsed="1"/>
+    <w:lsdException w:name="index 9" w:semiHidden="1" w:unhideWhenUsed="1"/>
+    <w:lsdException w:name="toc 1" w:semiHidden="1" w:uiPriority="39" w:unhideWhenUsed="1"/>
+    <w:lsdException w:name="toc 2" w:semiHidden="1" w:uiPriority="39" w:unhideWhenUsed="1"/>
+    <w:lsdException w:name="toc 3" w:semiHidden="1" w:uiPriority="39" w:unhideWhenUsed="1"/>
+    <w:lsdException w:name="toc 4" w:semiHidden="1" w:uiPriority="39" w:unhideWhenUsed="1"/>
+    <w:lsdException w:name="toc 5" w:semiHidden="1" w:uiPriority="39" w:unhideWhenUsed="1"/>
+    <w:lsdException w:name="toc 6" w:semiHidden="1" w:uiPriority="39" w:unhideWhenUsed="1"/>
+    <w:lsdException w:name="toc 7" w:semiHidden="1" w:uiPriority="39" w:unhideWhenUsed="1"/>
+    <w:lsdException w:name="toc 8" w:semiHidden="1" w:uiPriority="39" w:unhideWhenUsed="1"/>
+    <w:lsdException w:name="toc 9" w:semiHidden="1" w:uiPriority="39" w:unhideWhenUsed="1"/>
+    <w:lsdException w:name="Normal Indent" w:semiHidden="1" w:unhideWhenUsed="1"/>
+    <w:lsdException w:name="footnote text" w:semiHidden="1" w:unhideWhenUsed="1"/>
+    <w:lsdException w:name="annotation text" w:semiHidden="1" w:unhideWhenUsed="1"/>
+    <w:lsdException w:name="header" w:unhideWhenUsed="1"/>
+    <w:lsdException w:name="footer" w:unhideWhenUsed="1"/>
+    <w:lsdException w:name="index heading" w:semiHidden="1" w:unhideWhenUsed="1"/>
+    <w:lsdException w:name="caption" w:semiHidden="1" w:uiPriority="35" w:unhideWhenUsed="1" w:qFormat="1"/>
+    <w:lsdException w:name="table of figures" w:semiHidden="1" w:unhideWhenUsed="1"/>
+    <w:lsdException w:name="envelope address" w:semiHidden="1" w:unhideWhenUsed="1"/>
+    <w:lsdException w:name="envelope return" w:semiHidden="1" w:unhideWhenUsed="1"/>
+    <w:lsdException w:name="footnote reference" w:semiHidden="1" w:unhideWhenUsed="1"/>
+    <w:lsdException w:name="annotation reference" w:semiHidden="1" w:unhideWhenUsed="1"/>
+    <w:lsdException w:name="line number" w:semiHidden="1" w:unhideWhenUsed="1"/>
+    <w:lsdException w:name="page number" w:semiHidden="1" w:unhideWhenUsed="1"/>
+    <w:lsdException w:name="endnote reference" w:semiHidden="1" w:unhideWhenUsed="1"/>
+    <w:lsdException w:name="endnote text" w:semiHidden="1" w:unhideWhenUsed="1"/>
+    <w:lsdException w:name="table of authorities" w:semiHidden="1" w:unhideWhenUsed="1"/>
+    <w:lsdException w:name="macro" w:semiHidden="1" w:unhideWhenUsed="1"/>
+    <w:lsdException w:name="toa heading" w:semiHidden="1" w:unhideWhenUsed="1"/>
+    <w:lsdException w:name="List" w:semiHidden="1" w:unhideWhenUsed="1"/>
+    <w:lsdException w:name="List Bullet" w:semiHidden="1" w:unhideWhenUsed="1"/>
+    <w:lsdException w:name="List Number" w:semiHidden="1" w:unhideWhenUsed="1"/>
+    <w:lsdException w:name="List 2" w:semiHidden="1" w:unhideWhenUsed="1"/>
+    <w:lsdException w:name="List 3" w:semiHidden="1" w:unhideWhenUsed="1"/>
+    <w:lsdException w:name="List 4" w:semiHidden="1" w:unhideWhenUsed="1"/>
+    <w:lsdException w:name="List 5" w:semiHidden="1" w:unhideWhenUsed="1"/>
+    <w:lsdException w:name="List Bullet 2" w:semiHidden="1" w:unhideWhenUsed="1"/>
+    <w:lsdException w:name="List Bullet 3" w:semiHidden="1" w:unhideWhenUsed="1"/>
+    <w:lsdException w:name="List Bullet 4" w:semiHidden="1" w:unhideWhenUsed="1"/>
+    <w:lsdException w:name="List Bullet 5" w:semiHidden="1" w:unhideWhenUsed="1"/>
+    <w:lsdException w:name="List Number 2" w:semiHidden="1" w:unhideWhenUsed="1"/>
+    <w:lsdException w:name="List Number 3" w:semiHidden="1" w:unhideWhenUsed="1"/>
+    <w:lsdException w:name="List Number 4" w:semiHidden="1" w:unhideWhenUsed="1"/>
+    <w:lsdException w:name="List Number 5" w:semiHidden="1" w:unhideWhenUsed="1"/>
+    <w:lsdException w:name="Title" w:uiPriority="10" w:qFormat="1"/>
+    <w:lsdException w:name="Closing" w:semiHidden="1" w:unhideWhenUsed="1"/>
+    <w:lsdException w:name="Signature" w:semiHidden="1" w:unhideWhenUsed="1"/>
+    <w:lsdException w:name="Default Paragraph Font" w:uiPriority="1" w:unhideWhenUsed="1"/>
+    <w:lsdException w:name="Body Text" w:semiHidden="1" w:unhideWhenUsed="1"/>
+    <w:lsdException w:name="Body Text Indent" w:semiHidden="1" w:unhideWhenUsed="1"/>
+    <w:lsdException w:name="List Continue" w:semiHidden="1" w:unhideWhenUsed="1"/>
+    <w:lsdException w:name="List Continue 2" w:semiHidden="1" w:unhideWhenUsed="1"/>
+    <w:lsdException w:name="List Continue 3" w:semiHidden="1" w:unhideWhenUsed="1"/>
+    <w:lsdException w:name="List Continue 4" w:semiHidden="1" w:unhideWhenUsed="1"/>
+    <w:lsdException w:name="List Continue 5" w:semiHidden="1" w:unhideWhenUsed="1"/>
+    <w:lsdException w:name="Message Header" w:semiHidden="1" w:unhideWhenUsed="1"/>
+    <w:lsdException w:name="Subtitle" w:uiPriority="11" w:qFormat="1"/>
+    <w:lsdException w:name="Salutation" w:semiHidden="1" w:unhideWhenUsed="1"/>
+    <w:lsdException w:name="Date" w:semiHidden="1" w:unhideWhenUsed="1"/>
+    <w:lsdException w:name="Body Text First Indent" w:semiHidden="1" w:unhideWhenUsed="1"/>
+    <w:lsdException w:name="Body Text First Indent 2" w:semiHidden="1" w:unhideWhenUsed="1"/>
+    <w:lsdException w:name="Note Heading" w:semiHidden="1" w:unhideWhenUsed="1"/>
+    <w:lsdException w:name="Body Text 2" w:semiHidden="1" w:unhideWhenUsed="1"/>
+    <w:lsdException w:name="Body Text 3" w:semiHidden="1" w:unhideWhenUsed="1"/>
+    <w:lsdException w:name="Body Text Indent 2" w:semiHidden="1" w:unhideWhenUsed="1"/>
+    <w:lsdException w:name="Body Text Indent 3" w:semiHidden="1" w:unhideWhenUsed="1"/>
+    <w:lsdException w:name="Block Text" w:semiHidden="1" w:unhideWhenUsed="1"/>
+    <w:lsdException w:name="Hyperlink" w:semiHidden="1" w:unhideWhenUsed="1"/>
+    <w:lsdException w:name="FollowedHyperlink" w:semiHidden="1" w:unhideWhenUsed="1"/>
+    <w:lsdException w:name="Strong" w:uiPriority="22" w:qFormat="1"/>
+    <w:lsdException w:name="Emphasis" w:uiPriority="20" w:qFormat="1"/>
+    <w:lsdException w:name="Document Map" w:semiHidden="1" w:unhideWhenUsed="1"/>
+    <w:lsdException w:name="Plain Text" w:semiHidden="1" w:unhideWhenUsed="1"/>
+    <w:lsdException w:name="E-mail Signature" w:semiHidden="1" w:unhideWhenUsed="1"/>
+    <w:lsdException w:name="HTML Top of Form" w:semiHidden="1" w:unhideWhenUsed="1"/>
+    <w:lsdException w:name="HTML Bottom of Form" w:semiHidden="1" w:unhideWhenUsed="1"/>
+    <w:lsdException w:name="Normal (Web)" w:semiHidden="1" w:unhideWhenUsed="1"/>
+    <w:lsdException w:name="HTML Acronym" w:semiHidden="1" w:unhideWhenUsed="1"/>
+    <w:lsdException w:name="HTML Address" w:semiHidden="1" w:unhideWhenUsed="1"/>
+    <w:lsdException w:name="HTML Cite" w:semiHidden="1" w:unhideWhenUsed="1"/>
+    <w:lsdException w:name="HTML Code" w:semiHidden="1" w:unhideWhenUsed="1"/>
+    <w:lsdException w:name="HTML Definition" w:semiHidden="1" w:unhideWhenUsed="1"/>
+    <w:lsdException w:name="HTML Keyboard" w:semiHidden="1" w:unhideWhenUsed="1"/>
+    <w:lsdException w:name="HTML Preformatted" w:semiHidden="1" w:unhideWhenUsed="1"/>
+    <w:lsdException w:name="HTML Sample" w:semiHidden="1" w:unhideWhenUsed="1"/>
+    <w:lsdException w:name="HTML Typewriter" w:semiHidden="1" w:unhideWhenUsed="1"/>
+    <w:lsdException w:name="HTML Variable" w:semiHidden="1" w:unhideWhenUsed="1"/>
+    <w:lsdException w:name="Normal Table" w:semiHidden="1" w:unhideWhenUsed="1" w:qFormat="1"/>
+    <w:lsdException w:name="annotation subject" w:semiHidden="1" w:unhideWhenUsed="1"/>
+    <w:lsdException w:name="No List" w:semiHidden="1" w:unhideWhenUsed="1"/>
+    <w:lsdException w:name="Outline List 1" w:semiHidden="1" w:unhideWhenUsed="1"/>
+    <w:lsdException w:name="Outline List 2" w:semiHidden="1" w:unhideWhenUsed="1"/>
+    <w:lsdException w:name="Outline List 3" w:semiHidden="1" w:unhideWhenUsed="1"/>
+    <w:lsdException w:name="Table Simple 1" w:semiHidden="1" w:unhideWhenUsed="1"/>
+    <w:lsdException w:name="Table Simple 2" w:semiHidden="1" w:unhideWhenUsed="1"/>
+    <w:lsdException w:name="Table Simple 3" w:semiHidden="1" w:unhideWhenUsed="1"/>
+    <w:lsdException w:name="Table Classic 1" w:semiHidden="1" w:unhideWhenUsed="1"/>
+    <w:lsdException w:name="Table Classic 2" w:semiHidden="1" w:unhideWhenUsed="1"/>
+    <w:lsdException w:name="Table Classic 3" w:semiHidden="1" w:unhideWhenUsed="1"/>
+    <w:lsdException w:name="Table Classic 4" w:semiHidden="1" w:unhideWhenUsed="1"/>
+    <w:lsdException w:name="Table Colorful 1" w:semiHidden="1" w:unhideWhenUsed="1"/>
+    <w:lsdException w:name="Table Colorful 2" w:semiHidden="1" w:unhideWhenUsed="1"/>
+    <w:lsdException w:name="Table Colorful 3" w:semiHidden="1" w:unhideWhenUsed="1"/>
+    <w:lsdException w:name="Table Columns 1" w:semiHidden="1" w:unhideWhenUsed="1"/>
+    <w:lsdException w:name="Table Columns 2" w:semiHidden="1" w:unhideWhenUsed="1"/>
+    <w:lsdException w:name="Table Columns 3" w:semiHidden="1" w:unhideWhenUsed="1"/>
+    <w:lsdException w:name="Table Columns 4" w:semiHidden="1" w:unhideWhenUsed="1"/>
+    <w:lsdException w:name="Table Columns 5" w:semiHidden="1" w:unhideWhenUsed="1"/>
+    <w:lsdException w:name="Table Grid 1" w:semiHidden="1" w:unhideWhenUsed="1"/>
+    <w:lsdException w:name="Table Grid 2" w:semiHidden="1" w:unhideWhenUsed="1"/>
+    <w:lsdException w:name="Table Grid 3" w:semiHidden="1" w:unhideWhenUsed="1"/>
+    <w:lsdException w:name="Table Grid 4" w:semiHidden="1" w:unhideWhenUsed="1"/>
+    <w:lsdException w:name="Table Grid 5" w:semiHidden="1" w:unhideWhenUsed="1"/>
+    <w:lsdException w:name="Table Grid 6" w:semiHidden="1" w:unhideWhenUsed="1"/>
+    <w:lsdException w:name="Table Grid 7" w:semiHidden="1" w:unhideWhenUsed="1"/>
+    <w:lsdException w:name="Table Grid 8" w:semiHidden="1" w:unhideWhenUsed="1"/>
+    <w:lsdException w:name="Table List 1" w:semiHidden="1" w:unhideWhenUsed="1"/>
+    <w:lsdException w:name="Table List 2" w:semiHidden="1" w:unhideWhenUsed="1"/>
+    <w:lsdException w:name="Table List 3" w:semiHidden="1" w:unhideWhenUsed="1"/>
+    <w:lsdException w:name="Table List 4" w:semiHidden="1" w:unhideWhenUsed="1"/>
+    <w:lsdException w:name="Table List 5" w:semiHidden="1" w:unhideWhenUsed="1"/>
+    <w:lsdException w:name="Table List 6" w:semiHidden="1" w:unhideWhenUsed="1"/>
+    <w:lsdException w:name="Table List 7" w:semiHidden="1" w:unhideWhenUsed="1"/>
+    <w:lsdException w:name="Table List 8" w:semiHidden="1" w:unhideWhenUsed="1"/>
+    <w:lsdException w:name="Table 3D effects 1" w:semiHidden="1" w:unhideWhenUsed="1"/>
+    <w:lsdException w:name="Table 3D effects 2" w:semiHidden="1" w:unhideWhenUsed="1"/>
+    <w:lsdException w:name="Table 3D effects 3" w:semiHidden="1" w:unhideWhenUsed="1"/>
+    <w:lsdException w:name="Table Contemporary" w:semiHidden="1" w:unhideWhenUsed="1"/>
+    <w:lsdException w:name="Table Elegant" w:semiHidden="1" w:unhideWhenUsed="1"/>
+    <w:lsdException w:name="Table Professional" w:semiHidden="1" w:unhideWhenUsed="1"/>
+    <w:lsdException w:name="Table Subtle 1" w:semiHidden="1" w:unhideWhenUsed="1"/>
+    <w:lsdException w:name="Table Subtle 2" w:semiHidden="1" w:unhideWhenUsed="1"/>
+    <w:lsdException w:name="Table Web 1" w:semiHidden="1" w:unhideWhenUsed="1"/>
+    <w:lsdException w:name="Table Web 2" w:semiHidden="1" w:unhideWhenUsed="1"/>
+    <w:lsdException w:name="Table Web 3" w:semiHidden="1" w:unhideWhenUsed="1"/>
+    <w:lsdException w:name="Balloon Text" w:semiHidden="1" w:unhideWhenUsed="1"/>
+    <w:lsdException w:name="Table Theme" w:semiHidden="1" w:unhideWhenUsed="1"/>
+    <w:lsdException w:name="Placeholder Text" w:semiHidden="1" w:unhideWhenUsed="1"/>
+    <w:lsdException w:name="No Spacing" w:semiHidden="1" w:unhideWhenUsed="1"/>
+    <w:lsdException w:name="Light Shading"/>
+    <w:lsdException w:name="Light List"/>
+    <w:lsdException w:name="Light Grid"/>
+    <w:lsdException w:name="Medium Shading 1"/>
+    <w:lsdException w:name="Medium Shading 2"/>
+    <w:lsdException w:name="Medium List 1"/>
+    <w:lsdException w:name="Medium List 2"/>
+    <w:lsdException w:name="Medium Grid 1"/>
+    <w:lsdException w:name="Medium Grid 2"/>
+    <w:lsdException w:name="Medium Grid 3"/>
+    <w:lsdException w:name="Dark List"/>
+    <w:lsdException w:name="Colorful Shading"/>
+    <w:lsdException w:name="Colorful List"/>
+    <w:lsdException w:name="Colorful Grid"/>
+    <w:lsdException w:name="Light Shading Accent 1"/>
+    <w:lsdException w:name="Light List Accent 1"/>
+    <w:lsdException w:name="Light Grid Accent 1"/>
+    <w:lsdException w:name="Medium Shading 1 Accent 1"/>
+    <w:lsdException w:name="Medium Shading 2 Accent 1"/>
+    <w:lsdException w:name="Medium List 1 Accent 1"/>
+    <w:lsdException w:name="Revision" w:semiHidden="1" w:unhideWhenUsed="1"/>
+    <w:lsdException w:name="List Paragraph" w:uiPriority="34" w:qFormat="1"/>
+    <w:lsdException w:name="Quote" w:uiPriority="29" w:qFormat="1"/>
+    <w:lsdException w:name="Intense Quote" w:uiPriority="30" w:qFormat="1"/>
+    <w:lsdException w:name="Medium List 2 Accent 1"/>
+    <w:lsdException w:name="Medium Grid 1 Accent 1"/>
+    <w:lsdException w:name="Medium Grid 2 Accent 1"/>
+    <w:lsdException w:name="Medium Grid 3 Accent 1"/>
+    <w:lsdException w:name="Dark List Accent 1"/>
+    <w:lsdException w:name="Colorful Shading Accent 1"/>
+    <w:lsdException w:name="Colorful List Accent 1"/>
+    <w:lsdException w:name="Colorful Grid Accent 1"/>
+    <w:lsdException w:name="Light Shading Accent 2"/>
+    <w:lsdException w:name="Light List Accent 2"/>
+    <w:lsdException w:name="Light Grid Accent 2"/>
+    <w:lsdException w:name="Medium Shading 1 Accent 2"/>
+    <w:lsdException w:name="Medium Shading 2 Accent 2"/>
+    <w:lsdException w:name="Medium List 1 Accent 2"/>
+    <w:lsdException w:name="Medium List 2 Accent 2"/>
+    <w:lsdException w:name="Medium Grid 1 Accent 2"/>
+    <w:lsdException w:name="Medium Grid 2 Accent 2"/>
+    <w:lsdException w:name="Medium Grid 3 Accent 2"/>
+    <w:lsdException w:name="Dark List Accent 2"/>
+    <w:lsdException w:name="Colorful Shading Accent 2"/>
+    <w:lsdException w:name="Colorful List Accent 2"/>
+    <w:lsdException w:name="Colorful Grid Accent 2"/>
+    <w:lsdException w:name="Light Shading Accent 3"/>
+    <w:lsdException w:name="Light List Accent 3"/>
+    <w:lsdException w:name="Light Grid Accent 3"/>
+    <w:lsdException w:name="Medium Shading 1 Accent 3"/>
+    <w:lsdException w:name="Medium Shading 2 Accent 3"/>
+    <w:lsdException w:name="Medium List 1 Accent 3"/>
+    <w:lsdException w:name="Medium List 2 Accent 3"/>
+    <w:lsdException w:name="Medium Grid 1 Accent 3"/>
+    <w:lsdException w:name="Medium Grid 2 Accent 3"/>
+    <w:lsdException w:name="Medium Grid 3 Accent 3"/>
+    <w:lsdException w:name="Dark List Accent 3"/>
+    <w:lsdException w:name="Colorful Shading Accent 3"/>
+    <w:lsdException w:name="Colorful List Accent 3"/>
+    <w:lsdException w:name="Colorful Grid Accent 3"/>
+    <w:lsdException w:name="Light Shading Accent 4"/>
+    <w:lsdException w:name="Light List Accent 4"/>
+    <w:lsdException w:name="Light Grid Accent 4"/>
+    <w:lsdException w:name="Medium Shading 1 Accent 4"/>
+    <w:lsdException w:name="Medium Shading 2 Accent 4"/>
+    <w:lsdException w:name="Medium List 1 Accent 4"/>
+    <w:lsdException w:name="Medium List 2 Accent 4"/>
+    <w:lsdException w:name="Medium Grid 1 Accent 4"/>
+    <w:lsdException w:name="Medium Grid 2 Accent 4"/>
+    <w:lsdException w:name="Medium Grid 3 Accent 4"/>
+    <w:lsdException w:name="Dark List Accent 4"/>
+    <w:lsdException w:name="Colorful Shading Accent 4"/>
+    <w:lsdException w:name="Colorful List Accent 4"/>
+    <w:lsdException w:name="Colorful Grid Accent 4"/>
+    <w:lsdException w:name="Light Shading Accent 5"/>
+    <w:lsdException w:name="Light List Accent 5"/>
+    <w:lsdException w:name="Light Grid Accent 5"/>
+    <w:lsdException w:name="Medium Shading 1 Accent 5"/>
+    <w:lsdException w:name="Medium Shading 2 Accent 5"/>
+    <w:lsdException w:name="Medium List 1 Accent 5"/>
+    <w:lsdException w:name="Medium List 2 Accent 5"/>
+    <w:lsdException w:name="Medium Grid 1 Accent 5"/>
+    <w:lsdException w:name="Medium Grid 2 Accent 5"/>
+    <w:lsdException w:name="Medium Grid 3 Accent 5"/>
+    <w:lsdException w:name="Dark List Accent 5"/>
+    <w:lsdException w:name="Colorful Shading Accent 5"/>
+    <w:lsdException w:name="Colorful List Accent 5"/>
+    <w:lsdException w:name="Colorful Grid Accent 5"/>
+    <w:lsdException w:name="Light Shading Accent 6"/>
+    <w:lsdException w:name="Light List Accent 6"/>
+    <w:lsdException w:name="Light Grid Accent 6"/>
+    <w:lsdException w:name="Medium Shading 1 Accent 6"/>
+    <w:lsdException w:name="Medium Shading 2 Accent 6"/>
+    <w:lsdException w:name="Medium List 1 Accent 6"/>
+    <w:lsdException w:name="Medium List 2 Accent 6"/>
+    <w:lsdException w:name="Medium Grid 1 Accent 6"/>
+    <w:lsdException w:name="Medium Grid 2 Accent 6"/>
+    <w:lsdException w:name="Medium Grid 3 Accent 6"/>
+    <w:lsdException w:name="Dark List Accent 6"/>
+    <w:lsdException w:name="Colorful Shading Accent 6"/>
+    <w:lsdException w:name="Colorful List Accent 6"/>
+    <w:lsdException w:name="Colorful Grid Accent 6"/>
+    <w:lsdException w:name="Subtle Emphasis" w:uiPriority="19" w:qFormat="1"/>
+    <w:lsdException w:name="Intense Emphasis" w:uiPriority="21" w:qFormat="1"/>
+    <w:lsdException w:name="Subtle Reference" w:uiPriority="31" w:qFormat="1"/>
+    <w:lsdException w:name="Intense Reference" w:uiPriority="32" w:qFormat="1"/>
+    <w:lsdException w:name="Book Title" w:uiPriority="33" w:qFormat="1"/>
+    <w:lsdException w:name="Bibliography" w:semiHidden="1" w:uiPriority="37" w:unhideWhenUsed="1"/>
+    <w:lsdException w:name="TOC Heading" w:semiHidden="1" w:uiPriority="39" w:unhideWhenUsed="1" w:qFormat="1"/>
+    <w:lsdException w:name="Plain Table 1" w:uiPriority="41"/>
+    <w:lsdException w:name="Plain Table 2" w:uiPriority="42"/>
+    <w:lsdException w:name="Plain Table 3" w:uiPriority="43"/>
+    <w:lsdException w:name="Plain Table 4" w:uiPriority="44"/>
+    <w:lsdException w:name="Plain Table 5" w:uiPriority="45"/>
+    <w:lsdException w:name="Grid Table Light" w:uiPriority="40"/>
+    <w:lsdException w:name="Grid Table 1 Light" w:uiPriority="46"/>
+    <w:lsdException w:name="Grid Table 2" w:uiPriority="47"/>
+    <w:lsdException w:name="Grid Table 3" w:uiPriority="48"/>
+    <w:lsdException w:name="Grid Table 4" w:uiPriority="49"/>
+    <w:lsdException w:name="Grid Table 5 Dark" w:uiPriority="50"/>
+    <w:lsdException w:name="Grid Table 6 Colorful" w:uiPriority="51"/>
+    <w:lsdException w:name="Grid Table 7 Colorful" w:uiPriority="52"/>
+    <w:lsdException w:name="Grid Table 1 Light Accent 1" w:uiPriority="46"/>
+    <w:lsdException w:name="Grid Table 2 Accent 1" w:uiPriority="47"/>
+    <w:lsdException w:name="Grid Table 3 Accent 1" w:uiPriority="48"/>
+    <w:lsdException w:name="Grid Table 4 Accent 1" w:uiPriority="49"/>
+    <w:lsdException w:name="Grid Table 5 Dark Accent 1" w:uiPriority="50"/>
+    <w:lsdException w:name="Grid Table 6 Colorful Accent 1" w:uiPriority="51"/>
+    <w:lsdException w:name="Grid Table 7 Colorful Accent 1" w:uiPriority="52"/>
+    <w:lsdException w:name="Grid Table 1 Light Accent 2" w:uiPriority="46"/>
+    <w:lsdException w:name="Grid Table 2 Accent 2" w:uiPriority="47"/>
+    <w:lsdException w:name="Grid Table 3 Accent 2" w:uiPriority="48"/>
+    <w:lsdException w:name="Grid Table 4 Accent 2" w:uiPriority="49"/>
+    <w:lsdException w:name="Grid Table 5 Dark Accent 2" w:uiPriority="50"/>
+    <w:lsdException w:name="Grid Table 6 Colorful Accent 2" w:uiPriority="51"/>
+    <w:lsdException w:name="Grid Table 7 Colorful Accent 2" w:uiPriority="52"/>
+    <w:lsdException w:name="Grid Table 1 Light Accent 3" w:uiPriority="46"/>
+    <w:lsdException w:name="Grid Table 2 Accent 3" w:uiPriority="47"/>
+    <w:lsdException w:name="Grid Table 3 Accent 3" w:uiPriority="48"/>
+    <w:lsdException w:name="Grid Table 4 Accent 3" w:uiPriority="49"/>
+    <w:lsdException w:name="Grid Table 5 Dark Accent 3" w:uiPriority="50"/>
+    <w:lsdException w:name="Grid Table 6 Colorful Accent 3" w:uiPriority="51"/>
+    <w:lsdException w:name="Grid Table 7 Colorful Accent 3" w:uiPriority="52"/>
+    <w:lsdException w:name="Grid Table 1 Light Accent 4" w:uiPriority="46"/>
+    <w:lsdException w:name="Grid Table 2 Accent 4" w:uiPriority="47"/>
+    <w:lsdException w:name="Grid Table 3 Accent 4" w:uiPriority="48"/>
+    <w:lsdException w:name="Grid Table 4 Accent 4" w:uiPriority="49"/>
+    <w:lsdException w:name="Grid Table 5 Dark Accent 4" w:uiPriority="50"/>
+    <w:lsdException w:name="Grid Table 6 Colorful Accent 4" w:uiPriority="51"/>
+    <w:lsdException w:name="Grid Table 7 Colorful Accent 4" w:uiPriority="52"/>
+    <w:lsdException w:name="Grid Table 1 Light Accent 5" w:uiPriority="46"/>
+    <w:lsdException w:name="Grid Table 2 Accent 5" w:uiPriority="47"/>
+    <w:lsdException w:name="Grid Table 3 Accent 5" w:uiPriority="48"/>
+    <w:lsdException w:name="Grid Table 4 Accent 5" w:uiPriority="49"/>
+    <w:lsdException w:name="Grid Table 5 Dark Accent 5" w:uiPriority="50"/>
+    <w:lsdException w:name="Grid Table 6 Colorful Accent 5" w:uiPriority="51"/>
+    <w:lsdException w:name="Grid Table 7 Colorful Accent 5" w:uiPriority="52"/>
+    <w:lsdException w:name="Grid Table 1 Light Accent 6" w:uiPriority="46"/>
+    <w:lsdException w:name="Grid Table 2 Accent 6" w:uiPriority="47"/>
+    <w:lsdException w:name="Grid Table 3 Accent 6" w:uiPriority="48"/>
+    <w:lsdException w:name="Grid Table 4 Accent 6" w:uiPriority="49"/>
+    <w:lsdException w:name="Grid Table 5 Dark Accent 6" w:uiPriority="50"/>
+    <w:lsdException w:name="Grid Table 6 Colorful Accent 6" w:uiPriority="51"/>
+    <w:lsdException w:name="Grid Table 7 Colorful Accent 6" w:uiPriority="52"/>
+    <w:lsdException w:name="List Table 1 Light" w:uiPriority="46"/>
+    <w:lsdException w:name="List Table 2" w:uiPriority="47"/>
+    <w:lsdException w:name="List Table 3" w:uiPriority="48"/>
+    <w:lsdException w:name="List Table 4" w:uiPriority="49"/>
+    <w:lsdException w:name="List Table 5 Dark" w:uiPriority="50"/>
+    <w:lsdException w:name="List Table 6 Colorful" w:uiPriority="51"/>
+    <w:lsdException w:name="List Table 7 Colorful" w:uiPriority="52"/>
+    <w:lsdException w:name="List Table 1 Light Accent 1" w:uiPriority="46"/>
+    <w:lsdException w:name="List Table 2 Accent 1" w:uiPriority="47"/>
+    <w:lsdException w:name="List Table 3 Accent 1" w:uiPriority="48"/>
+    <w:lsdException w:name="List Table 4 Accent 1" w:uiPriority="49"/>
+    <w:lsdException w:name="List Table 5 Dark Accent 1" w:uiPriority="50"/>
+    <w:lsdException w:name="List Table 6 Colorful Accent 1" w:uiPriority="51"/>
+    <w:lsdException w:name="List Table 7 Colorful Accent 1" w:uiPriority="52"/>
+    <w:lsdException w:name="List Table 1 Light Accent 2" w:uiPriority="46"/>
+    <w:lsdException w:name="List Table 2 Accent 2" w:uiPriority="47"/>
+    <w:lsdException w:name="List Table 3 Accent 2" w:uiPriority="48"/>
+    <w:lsdException w:name="List Table 4 Accent 2" w:uiPriority="49"/>
+    <w:lsdException w:name="List Table 5 Dark Accent 2" w:uiPriority="50"/>
+    <w:lsdException w:name="List Table 6 Colorful Accent 2" w:uiPriority="51"/>
+    <w:lsdException w:name="List Table 7 Colorful Accent 2" w:uiPriority="52"/>
+    <w:lsdException w:name="List Table 1 Light Accent 3" w:uiPriority="46"/>
+    <w:lsdException w:name="List Table 2 Accent 3" w:uiPriority="47"/>
+    <w:lsdException w:name="List Table 3 Accent 3" w:uiPriority="48"/>
+    <w:lsdException w:name="List Table 4 Accent 3" w:uiPriority="49"/>
+    <w:lsdException w:name="List Table 5 Dark Accent 3" w:uiPriority="50"/>
+    <w:lsdException w:name="List Table 6 Colorful Accent 3" w:uiPriority="51"/>
+    <w:lsdException w:name="List Table 7 Colorful Accent 3" w:uiPriority="52"/>
+    <w:lsdException w:name="List Table 1 Light Accent 4" w:uiPriority="46"/>
+    <w:lsdException w:name="List Table 2 Accent 4" w:uiPriority="47"/>
+    <w:lsdException w:name="List Table 3 Accent 4" w:uiPriority="48"/>
+    <w:lsdException w:name="List Table 4 Accent 4" w:uiPriority="49"/>
+    <w:lsdException w:name="List Table 5 Dark Accent 4" w:uiPriority="50"/>
+    <w:lsdException w:name="List Table 6 Colorful Accent 4" w:uiPriority="51"/>
+    <w:lsdException w:name="List Table 7 Colorful Accent 4" w:uiPriority="52"/>
+    <w:lsdException w:name="List Table 1 Light Accent 5" w:uiPriority="46"/>
+    <w:lsdException w:name="List Table 2 Accent 5" w:uiPriority="47"/>
+    <w:lsdException w:name="List Table 3 Accent 5" w:uiPriority="48"/>
+    <w:lsdException w:name="List Table 4 Accent 5" w:uiPriority="49"/>
+    <w:lsdException w:name="List Table 5 Dark Accent 5" w:uiPriority="50"/>
+    <w:lsdException w:name="List Table 6 Colorful Accent 5" w:uiPriority="51"/>
+    <w:lsdException w:name="List Table 7 Colorful Accent 5" w:uiPriority="52"/>
+    <w:lsdException w:name="List Table 1 Light Accent 6" w:uiPriority="46"/>
+    <w:lsdException w:name="List Table 2 Accent 6" w:uiPriority="47"/>
+    <w:lsdException w:name="List Table 3 Accent 6" w:uiPriority="48"/>
+    <w:lsdException w:name="List Table 4 Accent 6" w:uiPriority="49"/>
+    <w:lsdException w:name="List Table 5 Dark Accent 6" w:uiPriority="50"/>
+    <w:lsdException w:name="List Table 6 Colorful Accent 6" w:uiPriority="51"/>
+    <w:lsdException w:name="List Table 7 Colorful Accent 6" w:uiPriority="52"/>
+    <w:lsdException w:name="Mention" w:semiHidden="1" w:unhideWhenUsed="1"/>
+    <w:lsdException w:name="Smart Hyperlink" w:semiHidden="1" w:unhideWhenUsed="1"/>
+    <w:lsdException w:name="Hashtag" w:semiHidden="1" w:unhideWhenUsed="1"/>
+    <w:lsdException w:name="Unresolved Mention" w:semiHidden="1" w:unhideWhenUsed="1"/>
+    <w:lsdException w:name="Smart Link" w:semiHidden="1" w:unhideWhenUsed="1"/>
   </w:latentStyles>
-  <w:style w:type="paragraph" w:default="1" w:styleId="1">
+  <w:style w:type="paragraph" w:default="1" w:styleId="Normal">
     <w:name w:val="Normal"/>
     <w:qFormat/>
-    <w:uiPriority w:val="0"/>
     <w:pPr>
       <w:spacing w:after="160" w:line="278" w:lineRule="auto"/>
     </w:pPr>
     <w:rPr>
-      <w:rFonts w:asciiTheme="minorHAnsi" w:hAnsiTheme="minorHAnsi" w:eastAsiaTheme="minorHAnsi" w:cstheme="minorBidi"/>
+      <w:rFonts w:asciiTheme="minorHAnsi" w:eastAsiaTheme="minorHAnsi" w:hAnsiTheme="minorHAnsi" w:cstheme="minorBidi"/>
       <w:kern w:val="2"/>
       <w:sz w:val="24"/>
       <w:szCs w:val="24"/>
-      <w:lang w:val="fr-FR" w:eastAsia="en-US" w:bidi="ar-SA"/>
+      <w:lang w:eastAsia="en-US"/>
       <w14:ligatures w14:val="standardContextual"/>
     </w:rPr>
   </w:style>
-  <w:style w:type="paragraph" w:styleId="2">
+  <w:style w:type="paragraph" w:styleId="Titre1">
     <w:name w:val="heading 1"/>
-    <w:basedOn w:val="1"/>
-    <w:next w:val="1"/>
-    <w:link w:val="19"/>
+    <w:basedOn w:val="Normal"/>
+    <w:next w:val="Normal"/>
+    <w:link w:val="Titre1Car"/>
+    <w:uiPriority w:val="9"/>
     <w:qFormat/>
-    <w:uiPriority w:val="9"/>
     <w:pPr>
       <w:keepNext/>
       <w:keepLines/>
@@ -1506,21 +2593,21 @@
       <w:outlineLvl w:val="0"/>
     </w:pPr>
     <w:rPr>
-      <w:rFonts w:asciiTheme="majorHAnsi" w:hAnsiTheme="majorHAnsi" w:eastAsiaTheme="majorEastAsia" w:cstheme="majorBidi"/>
-      <w:color w:val="2F5597" w:themeColor="accent1" w:themeShade="BF"/>
+      <w:rFonts w:asciiTheme="majorHAnsi" w:eastAsiaTheme="majorEastAsia" w:hAnsiTheme="majorHAnsi" w:cstheme="majorBidi"/>
+      <w:color w:val="2F5496" w:themeColor="accent1" w:themeShade="BF"/>
       <w:sz w:val="40"/>
       <w:szCs w:val="40"/>
     </w:rPr>
   </w:style>
-  <w:style w:type="paragraph" w:styleId="3">
+  <w:style w:type="paragraph" w:styleId="Titre2">
     <w:name w:val="heading 2"/>
-    <w:basedOn w:val="1"/>
-    <w:next w:val="1"/>
-    <w:link w:val="20"/>
+    <w:basedOn w:val="Normal"/>
+    <w:next w:val="Normal"/>
+    <w:link w:val="Titre2Car"/>
+    <w:uiPriority w:val="9"/>
     <w:semiHidden/>
     <w:unhideWhenUsed/>
     <w:qFormat/>
-    <w:uiPriority w:val="9"/>
     <w:pPr>
       <w:keepNext/>
       <w:keepLines/>
@@ -1528,21 +2615,21 @@
       <w:outlineLvl w:val="1"/>
     </w:pPr>
     <w:rPr>
-      <w:rFonts w:asciiTheme="majorHAnsi" w:hAnsiTheme="majorHAnsi" w:eastAsiaTheme="majorEastAsia" w:cstheme="majorBidi"/>
-      <w:color w:val="2F5597" w:themeColor="accent1" w:themeShade="BF"/>
+      <w:rFonts w:asciiTheme="majorHAnsi" w:eastAsiaTheme="majorEastAsia" w:hAnsiTheme="majorHAnsi" w:cstheme="majorBidi"/>
+      <w:color w:val="2F5496" w:themeColor="accent1" w:themeShade="BF"/>
       <w:sz w:val="32"/>
       <w:szCs w:val="32"/>
     </w:rPr>
   </w:style>
-  <w:style w:type="paragraph" w:styleId="4">
+  <w:style w:type="paragraph" w:styleId="Titre3">
     <w:name w:val="heading 3"/>
-    <w:basedOn w:val="1"/>
-    <w:next w:val="1"/>
-    <w:link w:val="21"/>
+    <w:basedOn w:val="Normal"/>
+    <w:next w:val="Normal"/>
+    <w:link w:val="Titre3Car"/>
+    <w:uiPriority w:val="9"/>
     <w:semiHidden/>
     <w:unhideWhenUsed/>
     <w:qFormat/>
-    <w:uiPriority w:val="9"/>
     <w:pPr>
       <w:keepNext/>
       <w:keepLines/>
@@ -1551,20 +2638,20 @@
     </w:pPr>
     <w:rPr>
       <w:rFonts w:eastAsiaTheme="majorEastAsia" w:cstheme="majorBidi"/>
-      <w:color w:val="2F5597" w:themeColor="accent1" w:themeShade="BF"/>
+      <w:color w:val="2F5496" w:themeColor="accent1" w:themeShade="BF"/>
       <w:sz w:val="28"/>
       <w:szCs w:val="28"/>
     </w:rPr>
   </w:style>
-  <w:style w:type="paragraph" w:styleId="5">
+  <w:style w:type="paragraph" w:styleId="Titre4">
     <w:name w:val="heading 4"/>
-    <w:basedOn w:val="1"/>
-    <w:next w:val="1"/>
-    <w:link w:val="22"/>
+    <w:basedOn w:val="Normal"/>
+    <w:next w:val="Normal"/>
+    <w:link w:val="Titre4Car"/>
+    <w:uiPriority w:val="9"/>
     <w:semiHidden/>
     <w:unhideWhenUsed/>
     <w:qFormat/>
-    <w:uiPriority w:val="9"/>
     <w:pPr>
       <w:keepNext/>
       <w:keepLines/>
@@ -1575,18 +2662,18 @@
       <w:rFonts w:eastAsiaTheme="majorEastAsia" w:cstheme="majorBidi"/>
       <w:i/>
       <w:iCs/>
-      <w:color w:val="2F5597" w:themeColor="accent1" w:themeShade="BF"/>
+      <w:color w:val="2F5496" w:themeColor="accent1" w:themeShade="BF"/>
     </w:rPr>
   </w:style>
-  <w:style w:type="paragraph" w:styleId="6">
+  <w:style w:type="paragraph" w:styleId="Titre5">
     <w:name w:val="heading 5"/>
-    <w:basedOn w:val="1"/>
-    <w:next w:val="1"/>
-    <w:link w:val="23"/>
+    <w:basedOn w:val="Normal"/>
+    <w:next w:val="Normal"/>
+    <w:link w:val="Titre5Car"/>
+    <w:uiPriority w:val="9"/>
     <w:semiHidden/>
     <w:unhideWhenUsed/>
     <w:qFormat/>
-    <w:uiPriority w:val="9"/>
     <w:pPr>
       <w:keepNext/>
       <w:keepLines/>
@@ -1595,18 +2682,18 @@
     </w:pPr>
     <w:rPr>
       <w:rFonts w:eastAsiaTheme="majorEastAsia" w:cstheme="majorBidi"/>
-      <w:color w:val="2F5597" w:themeColor="accent1" w:themeShade="BF"/>
+      <w:color w:val="2F5496" w:themeColor="accent1" w:themeShade="BF"/>
     </w:rPr>
   </w:style>
-  <w:style w:type="paragraph" w:styleId="7">
+  <w:style w:type="paragraph" w:styleId="Titre6">
     <w:name w:val="heading 6"/>
-    <w:basedOn w:val="1"/>
-    <w:next w:val="1"/>
-    <w:link w:val="24"/>
+    <w:basedOn w:val="Normal"/>
+    <w:next w:val="Normal"/>
+    <w:link w:val="Titre6Car"/>
+    <w:uiPriority w:val="9"/>
     <w:semiHidden/>
     <w:unhideWhenUsed/>
     <w:qFormat/>
-    <w:uiPriority w:val="9"/>
     <w:pPr>
       <w:keepNext/>
       <w:keepLines/>
@@ -1618,25 +2705,17 @@
       <w:i/>
       <w:iCs/>
       <w:color w:val="595959" w:themeColor="text1" w:themeTint="A6"/>
-      <w14:textFill>
-        <w14:solidFill>
-          <w14:schemeClr w14:val="tx1">
-            <w14:lumMod w14:val="65000"/>
-            <w14:lumOff w14:val="35000"/>
-          </w14:schemeClr>
-        </w14:solidFill>
-      </w14:textFill>
     </w:rPr>
   </w:style>
-  <w:style w:type="paragraph" w:styleId="8">
+  <w:style w:type="paragraph" w:styleId="Titre7">
     <w:name w:val="heading 7"/>
-    <w:basedOn w:val="1"/>
-    <w:next w:val="1"/>
-    <w:link w:val="25"/>
+    <w:basedOn w:val="Normal"/>
+    <w:next w:val="Normal"/>
+    <w:link w:val="Titre7Car"/>
+    <w:uiPriority w:val="9"/>
     <w:semiHidden/>
     <w:unhideWhenUsed/>
     <w:qFormat/>
-    <w:uiPriority w:val="9"/>
     <w:pPr>
       <w:keepNext/>
       <w:keepLines/>
@@ -1646,25 +2725,17 @@
     <w:rPr>
       <w:rFonts w:eastAsiaTheme="majorEastAsia" w:cstheme="majorBidi"/>
       <w:color w:val="595959" w:themeColor="text1" w:themeTint="A6"/>
-      <w14:textFill>
-        <w14:solidFill>
-          <w14:schemeClr w14:val="tx1">
-            <w14:lumMod w14:val="65000"/>
-            <w14:lumOff w14:val="35000"/>
-          </w14:schemeClr>
-        </w14:solidFill>
-      </w14:textFill>
     </w:rPr>
   </w:style>
-  <w:style w:type="paragraph" w:styleId="9">
+  <w:style w:type="paragraph" w:styleId="Titre8">
     <w:name w:val="heading 8"/>
-    <w:basedOn w:val="1"/>
-    <w:next w:val="1"/>
-    <w:link w:val="26"/>
+    <w:basedOn w:val="Normal"/>
+    <w:next w:val="Normal"/>
+    <w:link w:val="Titre8Car"/>
+    <w:uiPriority w:val="9"/>
     <w:semiHidden/>
     <w:unhideWhenUsed/>
     <w:qFormat/>
-    <w:uiPriority w:val="9"/>
     <w:pPr>
       <w:keepNext/>
       <w:keepLines/>
@@ -1676,25 +2747,17 @@
       <w:i/>
       <w:iCs/>
       <w:color w:val="262626" w:themeColor="text1" w:themeTint="D9"/>
-      <w14:textFill>
-        <w14:solidFill>
-          <w14:schemeClr w14:val="tx1">
-            <w14:lumMod w14:val="85000"/>
-            <w14:lumOff w14:val="15000"/>
-          </w14:schemeClr>
-        </w14:solidFill>
-      </w14:textFill>
     </w:rPr>
   </w:style>
-  <w:style w:type="paragraph" w:styleId="10">
+  <w:style w:type="paragraph" w:styleId="Titre9">
     <w:name w:val="heading 9"/>
-    <w:basedOn w:val="1"/>
-    <w:next w:val="1"/>
-    <w:link w:val="27"/>
+    <w:basedOn w:val="Normal"/>
+    <w:next w:val="Normal"/>
+    <w:link w:val="Titre9Car"/>
+    <w:uiPriority w:val="9"/>
     <w:semiHidden/>
     <w:unhideWhenUsed/>
     <w:qFormat/>
-    <w:uiPriority w:val="9"/>
     <w:pPr>
       <w:keepNext/>
       <w:keepLines/>
@@ -1704,28 +2767,21 @@
     <w:rPr>
       <w:rFonts w:eastAsiaTheme="majorEastAsia" w:cstheme="majorBidi"/>
       <w:color w:val="262626" w:themeColor="text1" w:themeTint="D9"/>
-      <w14:textFill>
-        <w14:solidFill>
-          <w14:schemeClr w14:val="tx1">
-            <w14:lumMod w14:val="85000"/>
-            <w14:lumOff w14:val="15000"/>
-          </w14:schemeClr>
-        </w14:solidFill>
-      </w14:textFill>
     </w:rPr>
   </w:style>
-  <w:style w:type="character" w:default="1" w:styleId="11">
+  <w:style w:type="character" w:default="1" w:styleId="Policepardfaut">
     <w:name w:val="Default Paragraph Font"/>
-    <w:unhideWhenUsed/>
     <w:uiPriority w:val="1"/>
-  </w:style>
-  <w:style w:type="table" w:default="1" w:styleId="18">
-    <w:name w:val="Normal Table"/>
     <w:semiHidden/>
     <w:unhideWhenUsed/>
-    <w:qFormat/>
+  </w:style>
+  <w:style w:type="table" w:default="1" w:styleId="TableauNormal">
+    <w:name w:val="Normal Table"/>
     <w:uiPriority w:val="99"/>
+    <w:semiHidden/>
+    <w:unhideWhenUsed/>
     <w:tblPr>
+      <w:tblInd w:w="0" w:type="dxa"/>
       <w:tblCellMar>
         <w:top w:w="0" w:type="dxa"/>
         <w:left w:w="108" w:type="dxa"/>
@@ -1734,22 +2790,228 @@
       </w:tblCellMar>
     </w:tblPr>
   </w:style>
-  <w:style w:type="character" w:styleId="12">
-    <w:name w:val="Hyperlink"/>
+  <w:style w:type="numbering" w:default="1" w:styleId="Aucuneliste">
+    <w:name w:val="No List"/>
+    <w:uiPriority w:val="99"/>
     <w:semiHidden/>
     <w:unhideWhenUsed/>
+  </w:style>
+  <w:style w:type="character" w:styleId="Lienhypertexte">
+    <w:name w:val="Hyperlink"/>
     <w:uiPriority w:val="99"/>
+    <w:semiHidden/>
+    <w:unhideWhenUsed/>
     <w:rPr>
       <w:color w:val="0000FF"/>
       <w:u w:val="single"/>
     </w:rPr>
   </w:style>
-  <w:style w:type="paragraph" w:styleId="13">
+  <w:style w:type="paragraph" w:styleId="Sous-titre">
     <w:name w:val="Subtitle"/>
-    <w:basedOn w:val="1"/>
-    <w:next w:val="1"/>
-    <w:link w:val="29"/>
+    <w:basedOn w:val="Normal"/>
+    <w:next w:val="Normal"/>
+    <w:link w:val="Sous-titreCar"/>
+    <w:uiPriority w:val="11"/>
     <w:qFormat/>
+    <w:rPr>
+      <w:rFonts w:eastAsiaTheme="majorEastAsia" w:cstheme="majorBidi"/>
+      <w:color w:val="595959" w:themeColor="text1" w:themeTint="A6"/>
+      <w:spacing w:val="15"/>
+      <w:sz w:val="28"/>
+      <w:szCs w:val="28"/>
+    </w:rPr>
+  </w:style>
+  <w:style w:type="paragraph" w:styleId="NormalWeb">
+    <w:name w:val="Normal (Web)"/>
+    <w:uiPriority w:val="99"/>
+    <w:semiHidden/>
+    <w:unhideWhenUsed/>
+    <w:pPr>
+      <w:spacing w:beforeAutospacing="1" w:afterAutospacing="1"/>
+    </w:pPr>
+    <w:rPr>
+      <w:sz w:val="24"/>
+      <w:szCs w:val="24"/>
+      <w:lang w:val="en-US" w:eastAsia="zh-CN"/>
+    </w:rPr>
+  </w:style>
+  <w:style w:type="paragraph" w:styleId="Pieddepage">
+    <w:name w:val="footer"/>
+    <w:basedOn w:val="Normal"/>
+    <w:link w:val="PieddepageCar"/>
+    <w:uiPriority w:val="99"/>
+    <w:unhideWhenUsed/>
+    <w:pPr>
+      <w:tabs>
+        <w:tab w:val="center" w:pos="4536"/>
+        <w:tab w:val="right" w:pos="9072"/>
+      </w:tabs>
+      <w:spacing w:after="0" w:line="240" w:lineRule="auto"/>
+    </w:pPr>
+  </w:style>
+  <w:style w:type="paragraph" w:styleId="En-tte">
+    <w:name w:val="header"/>
+    <w:basedOn w:val="Normal"/>
+    <w:link w:val="En-tteCar"/>
+    <w:uiPriority w:val="99"/>
+    <w:unhideWhenUsed/>
+    <w:pPr>
+      <w:tabs>
+        <w:tab w:val="center" w:pos="4536"/>
+        <w:tab w:val="right" w:pos="9072"/>
+      </w:tabs>
+      <w:spacing w:after="0" w:line="240" w:lineRule="auto"/>
+    </w:pPr>
+  </w:style>
+  <w:style w:type="paragraph" w:styleId="Titre">
+    <w:name w:val="Title"/>
+    <w:basedOn w:val="Normal"/>
+    <w:next w:val="Normal"/>
+    <w:link w:val="TitreCar"/>
+    <w:uiPriority w:val="10"/>
+    <w:qFormat/>
+    <w:pPr>
+      <w:spacing w:after="80" w:line="240" w:lineRule="auto"/>
+      <w:contextualSpacing/>
+    </w:pPr>
+    <w:rPr>
+      <w:rFonts w:asciiTheme="majorHAnsi" w:eastAsiaTheme="majorEastAsia" w:hAnsiTheme="majorHAnsi" w:cstheme="majorBidi"/>
+      <w:spacing w:val="-10"/>
+      <w:kern w:val="28"/>
+      <w:sz w:val="56"/>
+      <w:szCs w:val="56"/>
+    </w:rPr>
+  </w:style>
+  <w:style w:type="character" w:customStyle="1" w:styleId="Titre1Car">
+    <w:name w:val="Titre 1 Car"/>
+    <w:basedOn w:val="Policepardfaut"/>
+    <w:link w:val="Titre1"/>
+    <w:uiPriority w:val="9"/>
+    <w:rPr>
+      <w:rFonts w:asciiTheme="majorHAnsi" w:eastAsiaTheme="majorEastAsia" w:hAnsiTheme="majorHAnsi" w:cstheme="majorBidi"/>
+      <w:color w:val="2F5496" w:themeColor="accent1" w:themeShade="BF"/>
+      <w:sz w:val="40"/>
+      <w:szCs w:val="40"/>
+    </w:rPr>
+  </w:style>
+  <w:style w:type="character" w:customStyle="1" w:styleId="Titre2Car">
+    <w:name w:val="Titre 2 Car"/>
+    <w:basedOn w:val="Policepardfaut"/>
+    <w:link w:val="Titre2"/>
+    <w:uiPriority w:val="9"/>
+    <w:semiHidden/>
+    <w:qFormat/>
+    <w:rPr>
+      <w:rFonts w:asciiTheme="majorHAnsi" w:eastAsiaTheme="majorEastAsia" w:hAnsiTheme="majorHAnsi" w:cstheme="majorBidi"/>
+      <w:color w:val="2F5496" w:themeColor="accent1" w:themeShade="BF"/>
+      <w:sz w:val="32"/>
+      <w:szCs w:val="32"/>
+    </w:rPr>
+  </w:style>
+  <w:style w:type="character" w:customStyle="1" w:styleId="Titre3Car">
+    <w:name w:val="Titre 3 Car"/>
+    <w:basedOn w:val="Policepardfaut"/>
+    <w:link w:val="Titre3"/>
+    <w:uiPriority w:val="9"/>
+    <w:semiHidden/>
+    <w:qFormat/>
+    <w:rPr>
+      <w:rFonts w:eastAsiaTheme="majorEastAsia" w:cstheme="majorBidi"/>
+      <w:color w:val="2F5496" w:themeColor="accent1" w:themeShade="BF"/>
+      <w:sz w:val="28"/>
+      <w:szCs w:val="28"/>
+    </w:rPr>
+  </w:style>
+  <w:style w:type="character" w:customStyle="1" w:styleId="Titre4Car">
+    <w:name w:val="Titre 4 Car"/>
+    <w:basedOn w:val="Policepardfaut"/>
+    <w:link w:val="Titre4"/>
+    <w:uiPriority w:val="9"/>
+    <w:semiHidden/>
+    <w:qFormat/>
+    <w:rPr>
+      <w:rFonts w:eastAsiaTheme="majorEastAsia" w:cstheme="majorBidi"/>
+      <w:i/>
+      <w:iCs/>
+      <w:color w:val="2F5496" w:themeColor="accent1" w:themeShade="BF"/>
+    </w:rPr>
+  </w:style>
+  <w:style w:type="character" w:customStyle="1" w:styleId="Titre5Car">
+    <w:name w:val="Titre 5 Car"/>
+    <w:basedOn w:val="Policepardfaut"/>
+    <w:link w:val="Titre5"/>
+    <w:uiPriority w:val="9"/>
+    <w:semiHidden/>
+    <w:rPr>
+      <w:rFonts w:eastAsiaTheme="majorEastAsia" w:cstheme="majorBidi"/>
+      <w:color w:val="2F5496" w:themeColor="accent1" w:themeShade="BF"/>
+    </w:rPr>
+  </w:style>
+  <w:style w:type="character" w:customStyle="1" w:styleId="Titre6Car">
+    <w:name w:val="Titre 6 Car"/>
+    <w:basedOn w:val="Policepardfaut"/>
+    <w:link w:val="Titre6"/>
+    <w:uiPriority w:val="9"/>
+    <w:semiHidden/>
+    <w:rPr>
+      <w:rFonts w:eastAsiaTheme="majorEastAsia" w:cstheme="majorBidi"/>
+      <w:i/>
+      <w:iCs/>
+      <w:color w:val="595959" w:themeColor="text1" w:themeTint="A6"/>
+    </w:rPr>
+  </w:style>
+  <w:style w:type="character" w:customStyle="1" w:styleId="Titre7Car">
+    <w:name w:val="Titre 7 Car"/>
+    <w:basedOn w:val="Policepardfaut"/>
+    <w:link w:val="Titre7"/>
+    <w:uiPriority w:val="9"/>
+    <w:semiHidden/>
+    <w:rPr>
+      <w:rFonts w:eastAsiaTheme="majorEastAsia" w:cstheme="majorBidi"/>
+      <w:color w:val="595959" w:themeColor="text1" w:themeTint="A6"/>
+    </w:rPr>
+  </w:style>
+  <w:style w:type="character" w:customStyle="1" w:styleId="Titre8Car">
+    <w:name w:val="Titre 8 Car"/>
+    <w:basedOn w:val="Policepardfaut"/>
+    <w:link w:val="Titre8"/>
+    <w:uiPriority w:val="9"/>
+    <w:semiHidden/>
+    <w:rPr>
+      <w:rFonts w:eastAsiaTheme="majorEastAsia" w:cstheme="majorBidi"/>
+      <w:i/>
+      <w:iCs/>
+      <w:color w:val="262626" w:themeColor="text1" w:themeTint="D9"/>
+    </w:rPr>
+  </w:style>
+  <w:style w:type="character" w:customStyle="1" w:styleId="Titre9Car">
+    <w:name w:val="Titre 9 Car"/>
+    <w:basedOn w:val="Policepardfaut"/>
+    <w:link w:val="Titre9"/>
+    <w:uiPriority w:val="9"/>
+    <w:semiHidden/>
+    <w:rPr>
+      <w:rFonts w:eastAsiaTheme="majorEastAsia" w:cstheme="majorBidi"/>
+      <w:color w:val="262626" w:themeColor="text1" w:themeTint="D9"/>
+    </w:rPr>
+  </w:style>
+  <w:style w:type="character" w:customStyle="1" w:styleId="TitreCar">
+    <w:name w:val="Titre Car"/>
+    <w:basedOn w:val="Policepardfaut"/>
+    <w:link w:val="Titre"/>
+    <w:uiPriority w:val="10"/>
+    <w:rPr>
+      <w:rFonts w:asciiTheme="majorHAnsi" w:eastAsiaTheme="majorEastAsia" w:hAnsiTheme="majorHAnsi" w:cstheme="majorBidi"/>
+      <w:spacing w:val="-10"/>
+      <w:kern w:val="28"/>
+      <w:sz w:val="56"/>
+      <w:szCs w:val="56"/>
+    </w:rPr>
+  </w:style>
+  <w:style w:type="character" w:customStyle="1" w:styleId="Sous-titreCar">
+    <w:name w:val="Sous-titre Car"/>
+    <w:basedOn w:val="Policepardfaut"/>
+    <w:link w:val="Sous-titre"/>
     <w:uiPriority w:val="11"/>
     <w:rPr>
       <w:rFonts w:eastAsiaTheme="majorEastAsia" w:cstheme="majorBidi"/>
@@ -1757,266 +3019,15 @@
       <w:spacing w:val="15"/>
       <w:sz w:val="28"/>
       <w:szCs w:val="28"/>
-      <w14:textFill>
-        <w14:solidFill>
-          <w14:schemeClr w14:val="tx1">
-            <w14:lumMod w14:val="65000"/>
-            <w14:lumOff w14:val="35000"/>
-          </w14:schemeClr>
-        </w14:solidFill>
-      </w14:textFill>
     </w:rPr>
   </w:style>
-  <w:style w:type="paragraph" w:styleId="14">
-    <w:name w:val="Normal (Web)"/>
-    <w:semiHidden/>
-    <w:unhideWhenUsed/>
-    <w:uiPriority w:val="99"/>
-    <w:pPr>
-      <w:spacing w:before="0" w:beforeAutospacing="1" w:after="0" w:afterAutospacing="1"/>
-      <w:ind w:left="0" w:right="0"/>
-      <w:jc w:val="left"/>
-    </w:pPr>
-    <w:rPr>
-      <w:kern w:val="0"/>
-      <w:sz w:val="24"/>
-      <w:szCs w:val="24"/>
-      <w:lang w:val="en-US" w:eastAsia="zh-CN" w:bidi="ar"/>
-    </w:rPr>
-  </w:style>
-  <w:style w:type="paragraph" w:styleId="15">
-    <w:name w:val="footer"/>
-    <w:basedOn w:val="1"/>
-    <w:link w:val="38"/>
-    <w:unhideWhenUsed/>
-    <w:uiPriority w:val="99"/>
-    <w:pPr>
-      <w:tabs>
-        <w:tab w:val="center" w:pos="4536"/>
-        <w:tab w:val="right" w:pos="9072"/>
-      </w:tabs>
-      <w:spacing w:after="0" w:line="240" w:lineRule="auto"/>
-    </w:pPr>
-  </w:style>
-  <w:style w:type="paragraph" w:styleId="16">
-    <w:name w:val="header"/>
-    <w:basedOn w:val="1"/>
-    <w:link w:val="37"/>
-    <w:unhideWhenUsed/>
-    <w:uiPriority w:val="99"/>
-    <w:pPr>
-      <w:tabs>
-        <w:tab w:val="center" w:pos="4536"/>
-        <w:tab w:val="right" w:pos="9072"/>
-      </w:tabs>
-      <w:spacing w:after="0" w:line="240" w:lineRule="auto"/>
-    </w:pPr>
-  </w:style>
-  <w:style w:type="paragraph" w:styleId="17">
-    <w:name w:val="Title"/>
-    <w:basedOn w:val="1"/>
-    <w:next w:val="1"/>
-    <w:link w:val="28"/>
+  <w:style w:type="paragraph" w:styleId="Citation">
+    <w:name w:val="Quote"/>
+    <w:basedOn w:val="Normal"/>
+    <w:next w:val="Normal"/>
+    <w:link w:val="CitationCar"/>
+    <w:uiPriority w:val="29"/>
     <w:qFormat/>
-    <w:uiPriority w:val="10"/>
-    <w:pPr>
-      <w:spacing w:after="80" w:line="240" w:lineRule="auto"/>
-      <w:contextualSpacing/>
-    </w:pPr>
-    <w:rPr>
-      <w:rFonts w:asciiTheme="majorHAnsi" w:hAnsiTheme="majorHAnsi" w:eastAsiaTheme="majorEastAsia" w:cstheme="majorBidi"/>
-      <w:spacing w:val="-10"/>
-      <w:kern w:val="28"/>
-      <w:sz w:val="56"/>
-      <w:szCs w:val="56"/>
-    </w:rPr>
-  </w:style>
-  <w:style w:type="character" w:customStyle="1" w:styleId="19">
-    <w:name w:val="Titre 1 Car"/>
-    <w:basedOn w:val="11"/>
-    <w:link w:val="2"/>
-    <w:uiPriority w:val="9"/>
-    <w:rPr>
-      <w:rFonts w:asciiTheme="majorHAnsi" w:hAnsiTheme="majorHAnsi" w:eastAsiaTheme="majorEastAsia" w:cstheme="majorBidi"/>
-      <w:color w:val="2F5597" w:themeColor="accent1" w:themeShade="BF"/>
-      <w:sz w:val="40"/>
-      <w:szCs w:val="40"/>
-    </w:rPr>
-  </w:style>
-  <w:style w:type="character" w:customStyle="1" w:styleId="20">
-    <w:name w:val="Titre 2 Car"/>
-    <w:basedOn w:val="11"/>
-    <w:link w:val="3"/>
-    <w:semiHidden/>
-    <w:qFormat/>
-    <w:uiPriority w:val="9"/>
-    <w:rPr>
-      <w:rFonts w:asciiTheme="majorHAnsi" w:hAnsiTheme="majorHAnsi" w:eastAsiaTheme="majorEastAsia" w:cstheme="majorBidi"/>
-      <w:color w:val="2F5597" w:themeColor="accent1" w:themeShade="BF"/>
-      <w:sz w:val="32"/>
-      <w:szCs w:val="32"/>
-    </w:rPr>
-  </w:style>
-  <w:style w:type="character" w:customStyle="1" w:styleId="21">
-    <w:name w:val="Titre 3 Car"/>
-    <w:basedOn w:val="11"/>
-    <w:link w:val="4"/>
-    <w:semiHidden/>
-    <w:qFormat/>
-    <w:uiPriority w:val="9"/>
-    <w:rPr>
-      <w:rFonts w:eastAsiaTheme="majorEastAsia" w:cstheme="majorBidi"/>
-      <w:color w:val="2F5597" w:themeColor="accent1" w:themeShade="BF"/>
-      <w:sz w:val="28"/>
-      <w:szCs w:val="28"/>
-    </w:rPr>
-  </w:style>
-  <w:style w:type="character" w:customStyle="1" w:styleId="22">
-    <w:name w:val="Titre 4 Car"/>
-    <w:basedOn w:val="11"/>
-    <w:link w:val="5"/>
-    <w:semiHidden/>
-    <w:qFormat/>
-    <w:uiPriority w:val="9"/>
-    <w:rPr>
-      <w:rFonts w:eastAsiaTheme="majorEastAsia" w:cstheme="majorBidi"/>
-      <w:i/>
-      <w:iCs/>
-      <w:color w:val="2F5597" w:themeColor="accent1" w:themeShade="BF"/>
-    </w:rPr>
-  </w:style>
-  <w:style w:type="character" w:customStyle="1" w:styleId="23">
-    <w:name w:val="Titre 5 Car"/>
-    <w:basedOn w:val="11"/>
-    <w:link w:val="6"/>
-    <w:semiHidden/>
-    <w:uiPriority w:val="9"/>
-    <w:rPr>
-      <w:rFonts w:eastAsiaTheme="majorEastAsia" w:cstheme="majorBidi"/>
-      <w:color w:val="2F5597" w:themeColor="accent1" w:themeShade="BF"/>
-    </w:rPr>
-  </w:style>
-  <w:style w:type="character" w:customStyle="1" w:styleId="24">
-    <w:name w:val="Titre 6 Car"/>
-    <w:basedOn w:val="11"/>
-    <w:link w:val="7"/>
-    <w:semiHidden/>
-    <w:uiPriority w:val="9"/>
-    <w:rPr>
-      <w:rFonts w:eastAsiaTheme="majorEastAsia" w:cstheme="majorBidi"/>
-      <w:i/>
-      <w:iCs/>
-      <w:color w:val="595959" w:themeColor="text1" w:themeTint="A6"/>
-      <w14:textFill>
-        <w14:solidFill>
-          <w14:schemeClr w14:val="tx1">
-            <w14:lumMod w14:val="65000"/>
-            <w14:lumOff w14:val="35000"/>
-          </w14:schemeClr>
-        </w14:solidFill>
-      </w14:textFill>
-    </w:rPr>
-  </w:style>
-  <w:style w:type="character" w:customStyle="1" w:styleId="25">
-    <w:name w:val="Titre 7 Car"/>
-    <w:basedOn w:val="11"/>
-    <w:link w:val="8"/>
-    <w:semiHidden/>
-    <w:uiPriority w:val="9"/>
-    <w:rPr>
-      <w:rFonts w:eastAsiaTheme="majorEastAsia" w:cstheme="majorBidi"/>
-      <w:color w:val="595959" w:themeColor="text1" w:themeTint="A6"/>
-      <w14:textFill>
-        <w14:solidFill>
-          <w14:schemeClr w14:val="tx1">
-            <w14:lumMod w14:val="65000"/>
-            <w14:lumOff w14:val="35000"/>
-          </w14:schemeClr>
-        </w14:solidFill>
-      </w14:textFill>
-    </w:rPr>
-  </w:style>
-  <w:style w:type="character" w:customStyle="1" w:styleId="26">
-    <w:name w:val="Titre 8 Car"/>
-    <w:basedOn w:val="11"/>
-    <w:link w:val="9"/>
-    <w:semiHidden/>
-    <w:uiPriority w:val="9"/>
-    <w:rPr>
-      <w:rFonts w:eastAsiaTheme="majorEastAsia" w:cstheme="majorBidi"/>
-      <w:i/>
-      <w:iCs/>
-      <w:color w:val="262626" w:themeColor="text1" w:themeTint="D9"/>
-      <w14:textFill>
-        <w14:solidFill>
-          <w14:schemeClr w14:val="tx1">
-            <w14:lumMod w14:val="85000"/>
-            <w14:lumOff w14:val="15000"/>
-          </w14:schemeClr>
-        </w14:solidFill>
-      </w14:textFill>
-    </w:rPr>
-  </w:style>
-  <w:style w:type="character" w:customStyle="1" w:styleId="27">
-    <w:name w:val="Titre 9 Car"/>
-    <w:basedOn w:val="11"/>
-    <w:link w:val="10"/>
-    <w:semiHidden/>
-    <w:uiPriority w:val="9"/>
-    <w:rPr>
-      <w:rFonts w:eastAsiaTheme="majorEastAsia" w:cstheme="majorBidi"/>
-      <w:color w:val="262626" w:themeColor="text1" w:themeTint="D9"/>
-      <w14:textFill>
-        <w14:solidFill>
-          <w14:schemeClr w14:val="tx1">
-            <w14:lumMod w14:val="85000"/>
-            <w14:lumOff w14:val="15000"/>
-          </w14:schemeClr>
-        </w14:solidFill>
-      </w14:textFill>
-    </w:rPr>
-  </w:style>
-  <w:style w:type="character" w:customStyle="1" w:styleId="28">
-    <w:name w:val="Titre Car"/>
-    <w:basedOn w:val="11"/>
-    <w:link w:val="17"/>
-    <w:uiPriority w:val="10"/>
-    <w:rPr>
-      <w:rFonts w:asciiTheme="majorHAnsi" w:hAnsiTheme="majorHAnsi" w:eastAsiaTheme="majorEastAsia" w:cstheme="majorBidi"/>
-      <w:spacing w:val="-10"/>
-      <w:kern w:val="28"/>
-      <w:sz w:val="56"/>
-      <w:szCs w:val="56"/>
-    </w:rPr>
-  </w:style>
-  <w:style w:type="character" w:customStyle="1" w:styleId="29">
-    <w:name w:val="Sous-titre Car"/>
-    <w:basedOn w:val="11"/>
-    <w:link w:val="13"/>
-    <w:uiPriority w:val="11"/>
-    <w:rPr>
-      <w:rFonts w:eastAsiaTheme="majorEastAsia" w:cstheme="majorBidi"/>
-      <w:color w:val="595959" w:themeColor="text1" w:themeTint="A6"/>
-      <w:spacing w:val="15"/>
-      <w:sz w:val="28"/>
-      <w:szCs w:val="28"/>
-      <w14:textFill>
-        <w14:solidFill>
-          <w14:schemeClr w14:val="tx1">
-            <w14:lumMod w14:val="65000"/>
-            <w14:lumOff w14:val="35000"/>
-          </w14:schemeClr>
-        </w14:solidFill>
-      </w14:textFill>
-    </w:rPr>
-  </w:style>
-  <w:style w:type="paragraph" w:styleId="30">
-    <w:name w:val="Quote"/>
-    <w:basedOn w:val="1"/>
-    <w:next w:val="1"/>
-    <w:link w:val="31"/>
-    <w:qFormat/>
-    <w:uiPriority w:val="29"/>
     <w:pPr>
       <w:spacing w:before="160"/>
       <w:jc w:val="center"/>
@@ -2025,67 +3036,51 @@
       <w:i/>
       <w:iCs/>
       <w:color w:val="404040" w:themeColor="text1" w:themeTint="BF"/>
-      <w14:textFill>
-        <w14:solidFill>
-          <w14:schemeClr w14:val="tx1">
-            <w14:lumMod w14:val="75000"/>
-            <w14:lumOff w14:val="25000"/>
-          </w14:schemeClr>
-        </w14:solidFill>
-      </w14:textFill>
     </w:rPr>
   </w:style>
-  <w:style w:type="character" w:customStyle="1" w:styleId="31">
+  <w:style w:type="character" w:customStyle="1" w:styleId="CitationCar">
     <w:name w:val="Citation Car"/>
-    <w:basedOn w:val="11"/>
-    <w:link w:val="30"/>
+    <w:basedOn w:val="Policepardfaut"/>
+    <w:link w:val="Citation"/>
     <w:uiPriority w:val="29"/>
     <w:rPr>
       <w:i/>
       <w:iCs/>
       <w:color w:val="404040" w:themeColor="text1" w:themeTint="BF"/>
-      <w14:textFill>
-        <w14:solidFill>
-          <w14:schemeClr w14:val="tx1">
-            <w14:lumMod w14:val="75000"/>
-            <w14:lumOff w14:val="25000"/>
-          </w14:schemeClr>
-        </w14:solidFill>
-      </w14:textFill>
     </w:rPr>
   </w:style>
-  <w:style w:type="paragraph" w:styleId="32">
+  <w:style w:type="paragraph" w:styleId="Paragraphedeliste">
     <w:name w:val="List Paragraph"/>
-    <w:basedOn w:val="1"/>
+    <w:basedOn w:val="Normal"/>
+    <w:uiPriority w:val="34"/>
     <w:qFormat/>
-    <w:uiPriority w:val="34"/>
     <w:pPr>
       <w:ind w:left="720"/>
       <w:contextualSpacing/>
     </w:pPr>
   </w:style>
-  <w:style w:type="character" w:customStyle="1" w:styleId="33">
-    <w:name w:val="Intense Emphasis"/>
-    <w:basedOn w:val="11"/>
+  <w:style w:type="character" w:customStyle="1" w:styleId="Accentuationintense1">
+    <w:name w:val="Accentuation intense1"/>
+    <w:basedOn w:val="Policepardfaut"/>
+    <w:uiPriority w:val="21"/>
     <w:qFormat/>
-    <w:uiPriority w:val="21"/>
     <w:rPr>
       <w:i/>
       <w:iCs/>
-      <w:color w:val="2F5597" w:themeColor="accent1" w:themeShade="BF"/>
+      <w:color w:val="2F5496" w:themeColor="accent1" w:themeShade="BF"/>
     </w:rPr>
   </w:style>
-  <w:style w:type="paragraph" w:styleId="34">
+  <w:style w:type="paragraph" w:styleId="Citationintense">
     <w:name w:val="Intense Quote"/>
-    <w:basedOn w:val="1"/>
-    <w:next w:val="1"/>
-    <w:link w:val="35"/>
+    <w:basedOn w:val="Normal"/>
+    <w:next w:val="Normal"/>
+    <w:link w:val="CitationintenseCar"/>
+    <w:uiPriority w:val="30"/>
     <w:qFormat/>
-    <w:uiPriority w:val="30"/>
     <w:pPr>
       <w:pBdr>
-        <w:top w:val="single" w:color="2F5496" w:themeColor="accent1" w:themeShade="BF" w:sz="4" w:space="10"/>
-        <w:bottom w:val="single" w:color="2F5496" w:themeColor="accent1" w:themeShade="BF" w:sz="4" w:space="10"/>
+        <w:top w:val="single" w:sz="4" w:space="10" w:color="2F5496" w:themeColor="accent1" w:themeShade="BF"/>
+        <w:bottom w:val="single" w:sz="4" w:space="10" w:color="2F5496" w:themeColor="accent1" w:themeShade="BF"/>
       </w:pBdr>
       <w:spacing w:before="360" w:after="360"/>
       <w:ind w:left="864" w:right="864"/>
@@ -2094,43 +3089,43 @@
     <w:rPr>
       <w:i/>
       <w:iCs/>
-      <w:color w:val="2F5597" w:themeColor="accent1" w:themeShade="BF"/>
+      <w:color w:val="2F5496" w:themeColor="accent1" w:themeShade="BF"/>
     </w:rPr>
   </w:style>
-  <w:style w:type="character" w:customStyle="1" w:styleId="35">
+  <w:style w:type="character" w:customStyle="1" w:styleId="CitationintenseCar">
     <w:name w:val="Citation intense Car"/>
-    <w:basedOn w:val="11"/>
-    <w:link w:val="34"/>
+    <w:basedOn w:val="Policepardfaut"/>
+    <w:link w:val="Citationintense"/>
     <w:uiPriority w:val="30"/>
     <w:rPr>
       <w:i/>
       <w:iCs/>
-      <w:color w:val="2F5597" w:themeColor="accent1" w:themeShade="BF"/>
+      <w:color w:val="2F5496" w:themeColor="accent1" w:themeShade="BF"/>
     </w:rPr>
   </w:style>
-  <w:style w:type="character" w:customStyle="1" w:styleId="36">
-    <w:name w:val="Intense Reference"/>
-    <w:basedOn w:val="11"/>
+  <w:style w:type="character" w:customStyle="1" w:styleId="Rfrenceintense1">
+    <w:name w:val="Référence intense1"/>
+    <w:basedOn w:val="Policepardfaut"/>
+    <w:uiPriority w:val="32"/>
     <w:qFormat/>
-    <w:uiPriority w:val="32"/>
     <w:rPr>
       <w:b/>
       <w:bCs/>
       <w:smallCaps/>
-      <w:color w:val="2F5597" w:themeColor="accent1" w:themeShade="BF"/>
+      <w:color w:val="2F5496" w:themeColor="accent1" w:themeShade="BF"/>
       <w:spacing w:val="5"/>
     </w:rPr>
   </w:style>
-  <w:style w:type="character" w:customStyle="1" w:styleId="37">
+  <w:style w:type="character" w:customStyle="1" w:styleId="En-tteCar">
     <w:name w:val="En-tête Car"/>
-    <w:basedOn w:val="11"/>
-    <w:link w:val="16"/>
+    <w:basedOn w:val="Policepardfaut"/>
+    <w:link w:val="En-tte"/>
     <w:uiPriority w:val="99"/>
   </w:style>
-  <w:style w:type="character" w:customStyle="1" w:styleId="38">
+  <w:style w:type="character" w:customStyle="1" w:styleId="PieddepageCar">
     <w:name w:val="Pied de page Car"/>
-    <w:basedOn w:val="11"/>
-    <w:link w:val="15"/>
+    <w:basedOn w:val="Policepardfaut"/>
+    <w:link w:val="Pieddepage"/>
     <w:uiPriority w:val="99"/>
   </w:style>
 </w:styles>
@@ -2388,6 +3383,7 @@
     </a:fmtScheme>
   </a:themeElements>
   <a:objectDefaults/>
+  <a:extraClrSchemeLst/>
 </a:theme>
 </file>
 

</xml_diff>